<commit_message>
docs: quitar el mantenimiento del modelo v4 y agregar la comparacion con el modelo actual
El mantenimiento sigue fuera del alcance, igual que en v3 (RN-08). El
Programa Anual de Mantenimiento queda solo como fuente de sedes, pisos y
ubicacion de dependencias.

- Modelo: se quitan planes_mantenimiento, programaciones_mantenimiento,
  mantenimientos, dependencias.impacto_mantenimiento, el tipo de evento y
  el formato de mantenimiento. Quedan 31 tablas y 57 llaves foraneas
  (DBML y SQL).
- base-de-datos.md: nueva comparacion tabla por tabla entre el modelo que
  corre hoy (v3, 22 tablas) y el v4.
- Analisis v4.1 (md y Word): sin RF-60 a RF-64, CU-19 a CU-21 ni RN-28 de
  mantenimiento; la estructura organizacional pasa a RF-60.
- Reparto: Anuar toma Levantamientos y la anulacion de baja, Alex el
  tablero, Juan Camilo las cargas de valoraciones y adquisicion, y Manuel
  se queda con Administracion y QR.

Co-Authored-By: Claude Opus 5.5 <noreply@anthropic.com>
</commit_message>
<xml_diff>
--- a/docs/analisis-requerimientos-v4.docx
+++ b/docs/analisis-requerimientos-v4.docx
@@ -17,7 +17,7 @@
         <w:rPr>
           <w:b/>
         </w:rPr>
-        <w:t xml:space="preserve">Gobernación de Córdoba · Dirección TIC · Versión 4</w:t>
+        <w:t xml:space="preserve">Gobernación de Córdoba · Dirección TIC · Versión 4.1</w:t>
       </w:r>
     </w:p>
     <w:p>
@@ -76,7 +76,7 @@
       </w:r>
       <w:r>
         <w:rPr/>
-        <w:t xml:space="preserve"> de la Gobernación de Córdoba, desde su ingreso hasta su baja. Su ficha sigue la estructura oficial del inventario de activos (Manual GT-M4 y formato FOR.01). Ubica cada activo en la estructura organizacional vigente (Decreto 609 de 2023) y en las sedes reales, asigna sus responsables con el catálogo oficial de cargos (Decreto 607 de 2023) y registra el mantenimiento preventivo según el Programa Anual de Mantenimiento.</w:t>
+        <w:t xml:space="preserve"> de la Gobernación de Córdoba, desde su ingreso hasta su baja. Su ficha sigue la estructura oficial del inventario de activos (Manual GT-M4 y formato FOR.01). Ubica cada activo en la estructura organizacional vigente (Decreto 609 de 2023) y en las sedes reales y en las sedes reales que registra el Programa Anual de Mantenimiento, y asigna sus responsables con el catálogo oficial de cargos (Decreto 607 de 2023).</w:t>
       </w:r>
     </w:p>
     <w:p>
@@ -122,7 +122,7 @@
       </w:pPr>
       <w:r>
         <w:rPr/>
-        <w:t xml:space="preserve">3. Qué se les ha hecho: traslados, cambios de componentes, mantenimientos, diagnósticos.</w:t>
+        <w:t xml:space="preserve">3. Qué se les ha hecho: traslados, cambios de componentes, diagnósticos, reclasificaciones.</w:t>
       </w:r>
     </w:p>
     <w:p>
@@ -228,17 +228,7 @@
       </w:pPr>
       <w:r>
         <w:rPr/>
-        <w:t xml:space="preserve">Historial de eventos inmutable: alta, traslado, cambio de componente, </w:t>
-      </w:r>
-      <w:r>
-        <w:rPr>
-          <w:b/>
-        </w:rPr>
-        <w:t xml:space="preserve">mantenimiento</w:t>
-      </w:r>
-      <w:r>
-        <w:rPr/>
-        <w:t xml:space="preserve">, diagnóstico, </w:t>
+        <w:t xml:space="preserve">Historial de eventos inmutable: alta, traslado, cambio de componente, diagnóstico, </w:t>
       </w:r>
       <w:r>
         <w:rPr>
@@ -260,14 +250,8 @@
         </w:numPr>
       </w:pPr>
       <w:r>
-        <w:rPr>
-          <w:b/>
-        </w:rPr>
-        <w:t xml:space="preserve">Mantenimiento preventivo y correctivo</w:t>
-      </w:r>
-      <w:r>
-        <w:rPr/>
-        <w:t xml:space="preserve">: plan anual, programación por dependencia y mes, ejecución y cumplimiento. *(Cambio frente a v3, que lo excluía.)*</w:t>
+        <w:rPr/>
+        <w:t xml:space="preserve">Levantamiento de activos por proceso con acta de aceptación firmada (GT-M4 4.1).</w:t>
       </w:r>
     </w:p>
     <w:p>
@@ -280,7 +264,7 @@
       </w:pPr>
       <w:r>
         <w:rPr/>
-        <w:t xml:space="preserve">Levantamiento de activos por proceso con acta de aceptación firmada (GT-M4 4.1).</w:t>
+        <w:t xml:space="preserve">Formatos firmados (entrega y baja), acta de aceptación de activos, código QR y etiquetas.</w:t>
       </w:r>
     </w:p>
     <w:p>
@@ -293,7 +277,7 @@
       </w:pPr>
       <w:r>
         <w:rPr/>
-        <w:t xml:space="preserve">Formatos firmados (entrega, baja y mantenimiento), código QR y etiquetas.</w:t>
+        <w:t xml:space="preserve">Estructura organizacional oficial, sedes con sus pisos y personas responsables con datos mínimos.</w:t>
       </w:r>
     </w:p>
     <w:p>
@@ -306,7 +290,7 @@
       </w:pPr>
       <w:r>
         <w:rPr/>
-        <w:t xml:space="preserve">Estructura organizacional oficial, sedes con sus pisos y personas responsables con datos mínimos.</w:t>
+        <w:t xml:space="preserve">Carga de datos desde Excel con plantilla oficial: equipos, personas y valoraciones.</w:t>
       </w:r>
     </w:p>
     <w:p>
@@ -319,7 +303,16 @@
       </w:pPr>
       <w:r>
         <w:rPr/>
-        <w:t xml:space="preserve">Carga de datos desde Excel con plantilla oficial: equipos, personas y valoraciones.</w:t>
+        <w:t xml:space="preserve">Consultas, reportes y exportación de la matriz de activos en el formato FOR.01.</w:t>
+      </w:r>
+    </w:p>
+    <w:p>
+      <w:pPr/>
+      <w:r>
+        <w:rPr>
+          <w:b/>
+        </w:rPr>
+        <w:t xml:space="preserve">Excluido:</w:t>
       </w:r>
     </w:p>
     <w:p>
@@ -331,17 +324,14 @@
         </w:numPr>
       </w:pPr>
       <w:r>
-        <w:rPr/>
-        <w:t xml:space="preserve">Consultas, reportes y exportación de la matriz de activos en el formato FOR.01.</w:t>
-      </w:r>
-    </w:p>
-    <w:p>
-      <w:pPr/>
-      <w:r>
         <w:rPr>
           <w:b/>
         </w:rPr>
-        <w:t xml:space="preserve">Excluido:</w:t>
+        <w:t xml:space="preserve">Mantenimiento preventivo y correctivo</w:t>
+      </w:r>
+      <w:r>
+        <w:rPr/>
+        <w:t xml:space="preserve">: sigue siendo un procedimiento aparte, igual que en v3. Solo los cambios de componentes que resulten de él se registran en la hoja de vida (RN-08). El Programa Anual de Mantenimiento se usa únicamente como fuente de sedes, pisos y ubicación de dependencias.</w:t>
       </w:r>
     </w:p>
     <w:p>
@@ -632,7 +622,52 @@
             </w:r>
             <w:r>
               <w:rPr/>
-              <w:t xml:space="preserve"> documentación oficial en lugar del Excel 2026, que solo se usa para cargar datos. Estructura organizacional jerárquica, sedes reales con sus pisos, catálogo oficial de cargos, valoración GT-M4, datos de adquisición, mantenimiento preventivo dentro del alcance, levantamiento con acta. RF-52 a RF-65, RN-20 a RN-29, modelo de datos v4.</w:t>
+              <w:t xml:space="preserve"> documentación oficial en lugar del Excel 2026, que solo se usa para cargar datos. Estructura organizacional jerárquica, sedes reales con sus pisos, catálogo oficial de cargos, valoración GT-M4, datos de adquisición, levantamiento con acta. RF-52 a RF-60, RN-20 a RN-28, modelo de datos v4.</w:t>
+            </w:r>
+          </w:p>
+        </w:tc>
+      </w:tr>
+      <w:tr>
+        <w:trPr>
+          <w:cantSplit/>
+        </w:trPr>
+        <w:tc>
+          <w:tcPr>
+            <w:tcW w:w="1785" w:type="dxa"/>
+          </w:tcPr>
+          <w:p>
+            <w:pPr>
+              <w:pStyle w:val="Tabla"/>
+            </w:pPr>
+            <w:r>
+              <w:rPr>
+                <w:b/>
+              </w:rPr>
+              <w:t xml:space="preserve">4.1</w:t>
+            </w:r>
+          </w:p>
+        </w:tc>
+        <w:tc>
+          <w:tcPr>
+            <w:tcW w:w="7855" w:type="dxa"/>
+          </w:tcPr>
+          <w:p>
+            <w:pPr>
+              <w:pStyle w:val="Tabla"/>
+            </w:pPr>
+            <w:r>
+              <w:rPr/>
+              <w:t xml:space="preserve">Se confirma que el </w:t>
+            </w:r>
+            <w:r>
+              <w:rPr>
+                <w:b/>
+              </w:rPr>
+              <w:t xml:space="preserve">mantenimiento sigue fuera del alcance</w:t>
+            </w:r>
+            <w:r>
+              <w:rPr/>
+              <w:t xml:space="preserve">: se quitan el módulo de mantenimiento (antiguos RF-60 a RF-64), sus tablas, el tipo de evento, el formato, los casos de uso y los reportes; RN-08 vuelve a su texto de v3. La estructura organizacional pasa a ser RF-60.</w:t>
             </w:r>
           </w:p>
         </w:tc>
@@ -1035,7 +1070,7 @@
             </w:pPr>
             <w:r>
               <w:rPr/>
-              <w:t xml:space="preserve">Programa Anual de Mantenimiento Preventivo de la Dirección TIC.</w:t>
+              <w:t xml:space="preserve">Programa Anual de Mantenimiento Preventivo de la Dirección TIC. En este sistema solo aporta datos de sedes, pisos y dependencias.</w:t>
             </w:r>
           </w:p>
         </w:tc>
@@ -1398,8 +1433,14 @@
               <w:pStyle w:val="Tabla"/>
             </w:pPr>
             <w:r>
-              <w:rPr/>
-              <w:t xml:space="preserve">Objetivo, alcance y recursos del mantenimiento; programación mensual por dependencia con impacto alto, medio o bajo; sedes con dirección, pisos y dependencias por piso; conteos de equipos e impresoras; 2,5 h por dispositivo.</w:t>
+              <w:rPr>
+                <w:b/>
+              </w:rPr>
+              <w:t xml:space="preserve">Solo como fuente de ubicaciones:</w:t>
+            </w:r>
+            <w:r>
+              <w:rPr/>
+              <w:t xml:space="preserve"> sedes con dirección, pisos, dependencias por piso y conteos estimados de equipos e impresoras. Su programación de mantenimiento no entra al sistema (mantenimiento fuera del alcance).</w:t>
             </w:r>
           </w:p>
         </w:tc>
@@ -2100,7 +2141,7 @@
             </w:pPr>
             <w:r>
               <w:rPr/>
-              <w:t xml:space="preserve">Se registra como plan de la vigencia 2026.</w:t>
+              <w:t xml:space="preserve">Sus ubicaciones se toman como vigentes en 2026.</w:t>
             </w:r>
           </w:p>
         </w:tc>
@@ -2198,11 +2239,11 @@
         <w:rPr>
           <w:b/>
         </w:rPr>
-        <w:t xml:space="preserve">Hoy la entidad tiene tres inventarios que no se cruzan:</w:t>
-      </w:r>
-      <w:r>
-        <w:rPr/>
-        <w:t xml:space="preserve"> la matriz de activos de información (FOR.01, valoración de seguridad), el programa de mantenimiento (conteos por dependencia) y el inventario 2026 (equipos por puesto). El sistema los une en una sola ficha por equipo.</w:t>
+        <w:t xml:space="preserve">Hoy la entidad tiene tres fuentes que no se cruzan:</w:t>
+      </w:r>
+      <w:r>
+        <w:rPr/>
+        <w:t xml:space="preserve"> la matriz de activos de información (FOR.01, valoración de seguridad), el programa de mantenimiento (ubicaciones y conteos por dependencia) y el inventario 2026 (equipos por puesto). El sistema une la ficha y la valoración en un solo registro por equipo y toma del programa las ubicaciones oficiales.</w:t>
       </w:r>
     </w:p>
     <w:p>
@@ -2298,11 +2339,11 @@
         <w:rPr>
           <w:b/>
         </w:rPr>
-        <w:t xml:space="preserve">El mantenimiento preventivo existe como programa oficial</w:t>
-      </w:r>
-      <w:r>
-        <w:rPr/>
-        <w:t xml:space="preserve"> con meta mensual: 507 equipos y 64 impresoras, a 2,5 h por dispositivo.</w:t>
+        <w:t xml:space="preserve">El PAMP estima 507 equipos y 64 impresoras</w:t>
+      </w:r>
+      <w:r>
+        <w:rPr/>
+        <w:t xml:space="preserve"> en las sedes de la entidad: es la referencia para saber si la carga y la verificación quedaron completas.</w:t>
       </w:r>
     </w:p>
     <w:p>
@@ -2505,7 +2546,7 @@
             </w:pPr>
             <w:r>
               <w:rPr/>
-              <w:t xml:space="preserve">Registra equipos, valoraciones, traslados, componentes, mantenimientos, diagnósticos y bajas; genera formatos; sube documentos firmados; carga datos; consulta reportes.</w:t>
+              <w:t xml:space="preserve">Registra equipos, valoraciones, traslados, componentes, diagnósticos y bajas; genera formatos; sube documentos firmados; carga datos; consulta reportes.</w:t>
             </w:r>
           </w:p>
         </w:tc>
@@ -2764,7 +2805,7 @@
             </w:pPr>
             <w:r>
               <w:rPr/>
-              <w:t xml:space="preserve">Aprueba el PAMP, recibe reportes y cumplimiento.</w:t>
+              <w:t xml:space="preserve">Recibe reportes; firma como propietario los activos del proceso Gestión Tecnológica.</w:t>
             </w:r>
           </w:p>
         </w:tc>
@@ -2898,7 +2939,7 @@
         <w:rPr>
           <w:b/>
         </w:rPr>
-        <w:t xml:space="preserve">65 requerimientos en 13 módulos.</w:t>
+        <w:t xml:space="preserve">60 requerimientos en 12 módulos.</w:t>
       </w:r>
       <w:r>
         <w:rPr/>
@@ -2912,7 +2953,7 @@
       </w:r>
       <w:r>
         <w:rPr/>
-        <w:t xml:space="preserve">. Los nuevos son RF-52 a RF-65 </w:t>
+        <w:t xml:space="preserve">. Los nuevos son RF-52 a RF-60 </w:t>
       </w:r>
       <w:r>
         <w:rPr>
@@ -3574,7 +3615,7 @@
             </w:pPr>
             <w:r>
               <w:rPr/>
-              <w:t xml:space="preserve">Mostrar en una sola vista la ficha, la valoración vigente, la configuración y los componentes, el responsable y la ubicación, los datos de adquisición y el historial completo, incluidos los mantenimientos. </w:t>
+              <w:t xml:space="preserve">Mostrar en una sola vista la ficha, la valoración vigente, la configuración y los componentes, el responsable y la ubicación, los datos de adquisición y el historial completo. </w:t>
             </w:r>
             <w:r>
               <w:rPr>
@@ -3629,7 +3670,7 @@
             </w:pPr>
             <w:r>
               <w:rPr/>
-              <w:t xml:space="preserve">Registrar eventos con tipo, fecha, descripción y adjuntos. Tipos: alta, traslado, cambio de componente, mantenimiento, diagnóstico, valoración, baja, actualización de datos, anulación o aclaración. </w:t>
+              <w:t xml:space="preserve">Registrar eventos con tipo, fecha, descripción y adjuntos. Tipos: alta, traslado, cambio de componente, diagnóstico, valoración, baja, actualización de datos, anulación o aclaración. </w:t>
             </w:r>
             <w:r>
               <w:rPr>
@@ -5186,7 +5227,7 @@
             </w:pPr>
             <w:r>
               <w:rPr/>
-              <w:t xml:space="preserve">Exportar la hoja de vida completa en PDF (incluye valoración y mantenimientos). </w:t>
+              <w:t xml:space="preserve">Exportar la hoja de vida completa en PDF (incluye valoración y datos de adquisición). </w:t>
             </w:r>
             <w:r>
               <w:rPr>
@@ -6768,7 +6809,7 @@
       </w:pPr>
       <w:r>
         <w:rPr/>
-        <w:t xml:space="preserve">5.12 Mantenimiento preventivo y correctivo (nuevo v4)</w:t>
+        <w:t xml:space="preserve">5.12 Estructura organizacional (nuevo v4)</w:t>
       </w:r>
     </w:p>
     <w:tbl>
@@ -6883,346 +6924,6 @@
             </w:pPr>
             <w:r>
               <w:rPr/>
-              <w:t xml:space="preserve">Registrar el plan anual de mantenimiento por vigencia (código, versión, objetivo, alcance, horas por dispositivo) y su programación por dependencia, sede y mes, con impacto, responsable, equipo ejecutor y equipos estimados. Debe poder cargarse desde el Excel del PAMP.</w:t>
-            </w:r>
-          </w:p>
-        </w:tc>
-        <w:tc>
-          <w:tcPr>
-            <w:tcW w:w="1708" w:type="dxa"/>
-          </w:tcPr>
-          <w:p>
-            <w:pPr>
-              <w:pStyle w:val="Tabla"/>
-            </w:pPr>
-            <w:r>
-              <w:rPr/>
-              <w:t xml:space="preserve">E</w:t>
-            </w:r>
-          </w:p>
-        </w:tc>
-      </w:tr>
-      <w:tr>
-        <w:trPr>
-          <w:cantSplit/>
-        </w:trPr>
-        <w:tc>
-          <w:tcPr>
-            <w:tcW w:w="1305" w:type="dxa"/>
-            <w:shd w:val="clear" w:color="auto" w:fill="F3F5F8"/>
-          </w:tcPr>
-          <w:p>
-            <w:pPr>
-              <w:pStyle w:val="Tabla"/>
-            </w:pPr>
-            <w:r>
-              <w:rPr/>
-              <w:t xml:space="preserve">RF-61</w:t>
-            </w:r>
-          </w:p>
-        </w:tc>
-        <w:tc>
-          <w:tcPr>
-            <w:tcW w:w="6627" w:type="dxa"/>
-            <w:shd w:val="clear" w:color="auto" w:fill="F3F5F8"/>
-          </w:tcPr>
-          <w:p>
-            <w:pPr>
-              <w:pStyle w:val="Tabla"/>
-            </w:pPr>
-            <w:r>
-              <w:rPr/>
-              <w:t xml:space="preserve">Registrar el mantenimiento de un equipo (preventivo, enlazado a su programación, o correctivo) con checklist de actividades (inspección, limpieza, actualización, revisión), hallazgos, insumos, duración, estado resultante y ejecutor (propio o tercero). Si cambia una pieza, ofrecer el cambio de componente en el mismo flujo.</w:t>
-            </w:r>
-          </w:p>
-        </w:tc>
-        <w:tc>
-          <w:tcPr>
-            <w:tcW w:w="1708" w:type="dxa"/>
-            <w:shd w:val="clear" w:color="auto" w:fill="F3F5F8"/>
-          </w:tcPr>
-          <w:p>
-            <w:pPr>
-              <w:pStyle w:val="Tabla"/>
-            </w:pPr>
-            <w:r>
-              <w:rPr/>
-              <w:t xml:space="preserve">E</w:t>
-            </w:r>
-          </w:p>
-        </w:tc>
-      </w:tr>
-      <w:tr>
-        <w:trPr>
-          <w:cantSplit/>
-        </w:trPr>
-        <w:tc>
-          <w:tcPr>
-            <w:tcW w:w="1305" w:type="dxa"/>
-          </w:tcPr>
-          <w:p>
-            <w:pPr>
-              <w:pStyle w:val="Tabla"/>
-            </w:pPr>
-            <w:r>
-              <w:rPr/>
-              <w:t xml:space="preserve">RF-62</w:t>
-            </w:r>
-          </w:p>
-        </w:tc>
-        <w:tc>
-          <w:tcPr>
-            <w:tcW w:w="6627" w:type="dxa"/>
-          </w:tcPr>
-          <w:p>
-            <w:pPr>
-              <w:pStyle w:val="Tabla"/>
-            </w:pPr>
-            <w:r>
-              <w:rPr/>
-              <w:t xml:space="preserve">Generar la lista de trabajo de una programación: los equipos asignados hoy a esa dependencia y sede, con su estado.</w:t>
-            </w:r>
-          </w:p>
-        </w:tc>
-        <w:tc>
-          <w:tcPr>
-            <w:tcW w:w="1708" w:type="dxa"/>
-          </w:tcPr>
-          <w:p>
-            <w:pPr>
-              <w:pStyle w:val="Tabla"/>
-            </w:pPr>
-            <w:r>
-              <w:rPr/>
-              <w:t xml:space="preserve">E</w:t>
-            </w:r>
-          </w:p>
-        </w:tc>
-      </w:tr>
-      <w:tr>
-        <w:trPr>
-          <w:cantSplit/>
-        </w:trPr>
-        <w:tc>
-          <w:tcPr>
-            <w:tcW w:w="1305" w:type="dxa"/>
-            <w:shd w:val="clear" w:color="auto" w:fill="F3F5F8"/>
-          </w:tcPr>
-          <w:p>
-            <w:pPr>
-              <w:pStyle w:val="Tabla"/>
-            </w:pPr>
-            <w:r>
-              <w:rPr/>
-              <w:t xml:space="preserve">RF-63</w:t>
-            </w:r>
-          </w:p>
-        </w:tc>
-        <w:tc>
-          <w:tcPr>
-            <w:tcW w:w="6627" w:type="dxa"/>
-            <w:shd w:val="clear" w:color="auto" w:fill="F3F5F8"/>
-          </w:tcPr>
-          <w:p>
-            <w:pPr>
-              <w:pStyle w:val="Tabla"/>
-            </w:pPr>
-            <w:r>
-              <w:rPr/>
-              <w:t xml:space="preserve">Mostrar el cumplimiento del plan: equipos mantenidos frente a estimados, por mes, dependencia y sede, y los atrasados.</w:t>
-            </w:r>
-          </w:p>
-        </w:tc>
-        <w:tc>
-          <w:tcPr>
-            <w:tcW w:w="1708" w:type="dxa"/>
-            <w:shd w:val="clear" w:color="auto" w:fill="F3F5F8"/>
-          </w:tcPr>
-          <w:p>
-            <w:pPr>
-              <w:pStyle w:val="Tabla"/>
-            </w:pPr>
-            <w:r>
-              <w:rPr/>
-              <w:t xml:space="preserve">I</w:t>
-            </w:r>
-          </w:p>
-        </w:tc>
-      </w:tr>
-      <w:tr>
-        <w:trPr>
-          <w:cantSplit/>
-        </w:trPr>
-        <w:tc>
-          <w:tcPr>
-            <w:tcW w:w="1305" w:type="dxa"/>
-          </w:tcPr>
-          <w:p>
-            <w:pPr>
-              <w:pStyle w:val="Tabla"/>
-            </w:pPr>
-            <w:r>
-              <w:rPr/>
-              <w:t xml:space="preserve">RF-64</w:t>
-            </w:r>
-          </w:p>
-        </w:tc>
-        <w:tc>
-          <w:tcPr>
-            <w:tcW w:w="6627" w:type="dxa"/>
-          </w:tcPr>
-          <w:p>
-            <w:pPr>
-              <w:pStyle w:val="Tabla"/>
-            </w:pPr>
-            <w:r>
-              <w:rPr/>
-              <w:t xml:space="preserve">Generar el formato de mantenimiento en PDF por equipo o por programación, con espacio para la firma del responsable de la dependencia.</w:t>
-            </w:r>
-          </w:p>
-        </w:tc>
-        <w:tc>
-          <w:tcPr>
-            <w:tcW w:w="1708" w:type="dxa"/>
-          </w:tcPr>
-          <w:p>
-            <w:pPr>
-              <w:pStyle w:val="Tabla"/>
-            </w:pPr>
-            <w:r>
-              <w:rPr/>
-              <w:t xml:space="preserve">I</w:t>
-            </w:r>
-          </w:p>
-        </w:tc>
-      </w:tr>
-    </w:tbl>
-    <w:p>
-      <w:pPr>
-        <w:spacing w:after="60"/>
-      </w:pPr>
-    </w:p>
-    <w:p>
-      <w:pPr>
-        <w:pStyle w:val="Heading2"/>
-      </w:pPr>
-      <w:r>
-        <w:rPr/>
-        <w:t xml:space="preserve">5.13 Estructura organizacional (nuevo v4)</w:t>
-      </w:r>
-    </w:p>
-    <w:tbl>
-      <w:tblPr>
-        <w:tblW w:w="9640" w:type="dxa"/>
-        <w:tblBorders>
-          <w:top w:val="single" w:sz="4" w:space="0" w:color="C9CFD8"/>
-          <w:left w:val="single" w:sz="4" w:space="0" w:color="C9CFD8"/>
-          <w:bottom w:val="single" w:sz="4" w:space="0" w:color="C9CFD8"/>
-          <w:right w:val="single" w:sz="4" w:space="0" w:color="C9CFD8"/>
-          <w:insideH w:val="single" w:sz="4" w:space="0" w:color="C9CFD8"/>
-          <w:insideV w:val="single" w:sz="4" w:space="0" w:color="C9CFD8"/>
-        </w:tblBorders>
-        <w:tblLayout w:type="fixed"/>
-        <w:tblCellMar>
-          <w:top w:w="50" w:type="dxa"/>
-          <w:left w:w="90" w:type="dxa"/>
-          <w:bottom w:w="50" w:type="dxa"/>
-          <w:right w:w="90" w:type="dxa"/>
-        </w:tblCellMar>
-      </w:tblPr>
-      <w:tblGrid>
-        <w:gridCol w:w="1305"/>
-        <w:gridCol w:w="6627"/>
-        <w:gridCol w:w="1708"/>
-      </w:tblGrid>
-      <w:tr>
-        <w:trPr>
-          <w:tblHeader/>
-          <w:cantSplit/>
-        </w:trPr>
-        <w:tc>
-          <w:tcPr>
-            <w:tcW w:w="1305" w:type="dxa"/>
-            <w:shd w:val="clear" w:color="auto" w:fill="1F3A5F"/>
-          </w:tcPr>
-          <w:p>
-            <w:pPr>
-              <w:pStyle w:val="Tabla"/>
-            </w:pPr>
-            <w:r>
-              <w:rPr>
-                <w:color w:val="FFFFFF"/>
-                <w:b/>
-              </w:rPr>
-              <w:t xml:space="preserve">ID</w:t>
-            </w:r>
-          </w:p>
-        </w:tc>
-        <w:tc>
-          <w:tcPr>
-            <w:tcW w:w="6627" w:type="dxa"/>
-            <w:shd w:val="clear" w:color="auto" w:fill="1F3A5F"/>
-          </w:tcPr>
-          <w:p>
-            <w:pPr>
-              <w:pStyle w:val="Tabla"/>
-            </w:pPr>
-            <w:r>
-              <w:rPr>
-                <w:color w:val="FFFFFF"/>
-                <w:b/>
-              </w:rPr>
-              <w:t xml:space="preserve">Requerimiento</w:t>
-            </w:r>
-          </w:p>
-        </w:tc>
-        <w:tc>
-          <w:tcPr>
-            <w:tcW w:w="1708" w:type="dxa"/>
-            <w:shd w:val="clear" w:color="auto" w:fill="1F3A5F"/>
-          </w:tcPr>
-          <w:p>
-            <w:pPr>
-              <w:pStyle w:val="Tabla"/>
-            </w:pPr>
-            <w:r>
-              <w:rPr>
-                <w:color w:val="FFFFFF"/>
-                <w:b/>
-              </w:rPr>
-              <w:t xml:space="preserve">Prioridad</w:t>
-            </w:r>
-          </w:p>
-        </w:tc>
-      </w:tr>
-      <w:tr>
-        <w:trPr>
-          <w:cantSplit/>
-        </w:trPr>
-        <w:tc>
-          <w:tcPr>
-            <w:tcW w:w="1305" w:type="dxa"/>
-          </w:tcPr>
-          <w:p>
-            <w:pPr>
-              <w:pStyle w:val="Tabla"/>
-            </w:pPr>
-            <w:r>
-              <w:rPr/>
-              <w:t xml:space="preserve">RF-65</w:t>
-            </w:r>
-          </w:p>
-        </w:tc>
-        <w:tc>
-          <w:tcPr>
-            <w:tcW w:w="6627" w:type="dxa"/>
-          </w:tcPr>
-          <w:p>
-            <w:pPr>
-              <w:pStyle w:val="Tabla"/>
-            </w:pPr>
-            <w:r>
-              <w:rPr/>
               <w:t xml:space="preserve">Mostrar y filtrar por el árbol de dependencias: al elegir una secretaría se incluyen sus direcciones y áreas; las dependencias suprimidas se desactivan, sin borrarse, y se pueden fusionar con equivalencias.</w:t>
             </w:r>
           </w:p>
@@ -7601,7 +7302,7 @@
       </w:r>
       <w:r>
         <w:rPr/>
-        <w:t xml:space="preserve">, salvo </w:t>
+        <w:t xml:space="preserve">; se repite </w:t>
       </w:r>
       <w:r>
         <w:rPr>
@@ -7611,7 +7312,7 @@
       </w:r>
       <w:r>
         <w:rPr/>
-        <w:t xml:space="preserve">, que se reemplaza, y </w:t>
+        <w:t xml:space="preserve"> porque se confirmó en v4.1, y </w:t>
       </w:r>
       <w:r>
         <w:rPr>
@@ -7621,7 +7322,7 @@
       </w:r>
       <w:r>
         <w:rPr/>
-        <w:t xml:space="preserve">, que se amplía:</w:t>
+        <w:t xml:space="preserve"> se amplía:</w:t>
       </w:r>
     </w:p>
     <w:tbl>
@@ -7644,8 +7345,8 @@
         </w:tblCellMar>
       </w:tblPr>
       <w:tblGrid>
-        <w:gridCol w:w="3080"/>
-        <w:gridCol w:w="6560"/>
+        <w:gridCol w:w="3012"/>
+        <w:gridCol w:w="6628"/>
       </w:tblGrid>
       <w:tr>
         <w:trPr>
@@ -7654,7 +7355,7 @@
         </w:trPr>
         <w:tc>
           <w:tcPr>
-            <w:tcW w:w="3080" w:type="dxa"/>
+            <w:tcW w:w="3012" w:type="dxa"/>
             <w:shd w:val="clear" w:color="auto" w:fill="1F3A5F"/>
           </w:tcPr>
           <w:p>
@@ -7672,7 +7373,7 @@
         </w:tc>
         <w:tc>
           <w:tcPr>
-            <w:tcW w:w="6560" w:type="dxa"/>
+            <w:tcW w:w="6628" w:type="dxa"/>
             <w:shd w:val="clear" w:color="auto" w:fill="1F3A5F"/>
           </w:tcPr>
           <w:p>
@@ -7695,7 +7396,7 @@
         </w:trPr>
         <w:tc>
           <w:tcPr>
-            <w:tcW w:w="3080" w:type="dxa"/>
+            <w:tcW w:w="3012" w:type="dxa"/>
           </w:tcPr>
           <w:p>
             <w:pPr>
@@ -7709,43 +7410,32 @@
               <w:rPr>
                 <w:b/>
               </w:rPr>
-              <w:t xml:space="preserve">(reemplazada)</w:t>
-            </w:r>
-          </w:p>
-        </w:tc>
-        <w:tc>
-          <w:tcPr>
-            <w:tcW w:w="6560" w:type="dxa"/>
-          </w:tcPr>
-          <w:p>
-            <w:pPr>
-              <w:pStyle w:val="Tabla"/>
-            </w:pPr>
-            <w:r>
-              <w:rPr/>
-              <w:t xml:space="preserve">El mantenimiento preventivo y correctivo se registra como evento </w:t>
-            </w:r>
-            <w:r>
-              <w:rPr>
-                <w:rFonts w:ascii="Consolas" w:hAnsi="Consolas"/>
-                <w:sz w:val="19"/>
-              </w:rPr>
-              <w:t xml:space="preserve">mantenimiento</w:t>
-            </w:r>
-            <w:r>
-              <w:rPr/>
-              <w:t xml:space="preserve">. Si cambia una pieza, ese cambio se registra además como cambio de componente (RN-07).</w:t>
-            </w:r>
-          </w:p>
-        </w:tc>
-      </w:tr>
-      <w:tr>
-        <w:trPr>
-          <w:cantSplit/>
-        </w:trPr>
-        <w:tc>
-          <w:tcPr>
-            <w:tcW w:w="3080" w:type="dxa"/>
+              <w:t xml:space="preserve">(sin cambio)</w:t>
+            </w:r>
+          </w:p>
+        </w:tc>
+        <w:tc>
+          <w:tcPr>
+            <w:tcW w:w="6628" w:type="dxa"/>
+          </w:tcPr>
+          <w:p>
+            <w:pPr>
+              <w:pStyle w:val="Tabla"/>
+            </w:pPr>
+            <w:r>
+              <w:rPr/>
+              <w:t xml:space="preserve">El mantenimiento preventivo y correctivo no se registra en este sistema; solo sus efectos sobre los componentes, como cambio de componente.</w:t>
+            </w:r>
+          </w:p>
+        </w:tc>
+      </w:tr>
+      <w:tr>
+        <w:trPr>
+          <w:cantSplit/>
+        </w:trPr>
+        <w:tc>
+          <w:tcPr>
+            <w:tcW w:w="3012" w:type="dxa"/>
             <w:shd w:val="clear" w:color="auto" w:fill="F3F5F8"/>
           </w:tcPr>
           <w:p>
@@ -7766,7 +7456,7 @@
         </w:tc>
         <w:tc>
           <w:tcPr>
-            <w:tcW w:w="6560" w:type="dxa"/>
+            <w:tcW w:w="6628" w:type="dxa"/>
             <w:shd w:val="clear" w:color="auto" w:fill="F3F5F8"/>
           </w:tcPr>
           <w:p>
@@ -7786,7 +7476,7 @@
         </w:trPr>
         <w:tc>
           <w:tcPr>
-            <w:tcW w:w="3080" w:type="dxa"/>
+            <w:tcW w:w="3012" w:type="dxa"/>
           </w:tcPr>
           <w:p>
             <w:pPr>
@@ -7800,7 +7490,7 @@
         </w:tc>
         <w:tc>
           <w:tcPr>
-            <w:tcW w:w="6560" w:type="dxa"/>
+            <w:tcW w:w="6628" w:type="dxa"/>
           </w:tcPr>
           <w:p>
             <w:pPr>
@@ -7819,7 +7509,7 @@
         </w:trPr>
         <w:tc>
           <w:tcPr>
-            <w:tcW w:w="3080" w:type="dxa"/>
+            <w:tcW w:w="3012" w:type="dxa"/>
             <w:shd w:val="clear" w:color="auto" w:fill="F3F5F8"/>
           </w:tcPr>
           <w:p>
@@ -7834,7 +7524,7 @@
         </w:tc>
         <w:tc>
           <w:tcPr>
-            <w:tcW w:w="6560" w:type="dxa"/>
+            <w:tcW w:w="6628" w:type="dxa"/>
             <w:shd w:val="clear" w:color="auto" w:fill="F3F5F8"/>
           </w:tcPr>
           <w:p>
@@ -7854,7 +7544,7 @@
         </w:trPr>
         <w:tc>
           <w:tcPr>
-            <w:tcW w:w="3080" w:type="dxa"/>
+            <w:tcW w:w="3012" w:type="dxa"/>
           </w:tcPr>
           <w:p>
             <w:pPr>
@@ -7868,7 +7558,7 @@
         </w:tc>
         <w:tc>
           <w:tcPr>
-            <w:tcW w:w="6560" w:type="dxa"/>
+            <w:tcW w:w="6628" w:type="dxa"/>
           </w:tcPr>
           <w:p>
             <w:pPr>
@@ -7887,7 +7577,7 @@
         </w:trPr>
         <w:tc>
           <w:tcPr>
-            <w:tcW w:w="3080" w:type="dxa"/>
+            <w:tcW w:w="3012" w:type="dxa"/>
             <w:shd w:val="clear" w:color="auto" w:fill="F3F5F8"/>
           </w:tcPr>
           <w:p>
@@ -7902,7 +7592,7 @@
         </w:tc>
         <w:tc>
           <w:tcPr>
-            <w:tcW w:w="6560" w:type="dxa"/>
+            <w:tcW w:w="6628" w:type="dxa"/>
             <w:shd w:val="clear" w:color="auto" w:fill="F3F5F8"/>
           </w:tcPr>
           <w:p>
@@ -7922,7 +7612,7 @@
         </w:trPr>
         <w:tc>
           <w:tcPr>
-            <w:tcW w:w="3080" w:type="dxa"/>
+            <w:tcW w:w="3012" w:type="dxa"/>
           </w:tcPr>
           <w:p>
             <w:pPr>
@@ -7936,7 +7626,7 @@
         </w:tc>
         <w:tc>
           <w:tcPr>
-            <w:tcW w:w="6560" w:type="dxa"/>
+            <w:tcW w:w="6628" w:type="dxa"/>
           </w:tcPr>
           <w:p>
             <w:pPr>
@@ -7955,7 +7645,7 @@
         </w:trPr>
         <w:tc>
           <w:tcPr>
-            <w:tcW w:w="3080" w:type="dxa"/>
+            <w:tcW w:w="3012" w:type="dxa"/>
             <w:shd w:val="clear" w:color="auto" w:fill="F3F5F8"/>
           </w:tcPr>
           <w:p>
@@ -7970,7 +7660,7 @@
         </w:tc>
         <w:tc>
           <w:tcPr>
-            <w:tcW w:w="6560" w:type="dxa"/>
+            <w:tcW w:w="6628" w:type="dxa"/>
             <w:shd w:val="clear" w:color="auto" w:fill="F3F5F8"/>
           </w:tcPr>
           <w:p>
@@ -7990,7 +7680,7 @@
         </w:trPr>
         <w:tc>
           <w:tcPr>
-            <w:tcW w:w="3080" w:type="dxa"/>
+            <w:tcW w:w="3012" w:type="dxa"/>
           </w:tcPr>
           <w:p>
             <w:pPr>
@@ -8004,7 +7694,7 @@
         </w:tc>
         <w:tc>
           <w:tcPr>
-            <w:tcW w:w="6560" w:type="dxa"/>
+            <w:tcW w:w="6628" w:type="dxa"/>
           </w:tcPr>
           <w:p>
             <w:pPr>
@@ -8023,7 +7713,7 @@
         </w:trPr>
         <w:tc>
           <w:tcPr>
-            <w:tcW w:w="3080" w:type="dxa"/>
+            <w:tcW w:w="3012" w:type="dxa"/>
             <w:shd w:val="clear" w:color="auto" w:fill="F3F5F8"/>
           </w:tcPr>
           <w:p>
@@ -8038,7 +7728,7 @@
         </w:tc>
         <w:tc>
           <w:tcPr>
-            <w:tcW w:w="6560" w:type="dxa"/>
+            <w:tcW w:w="6628" w:type="dxa"/>
             <w:shd w:val="clear" w:color="auto" w:fill="F3F5F8"/>
           </w:tcPr>
           <w:p>
@@ -8058,7 +7748,7 @@
         </w:trPr>
         <w:tc>
           <w:tcPr>
-            <w:tcW w:w="3080" w:type="dxa"/>
+            <w:tcW w:w="3012" w:type="dxa"/>
           </w:tcPr>
           <w:p>
             <w:pPr>
@@ -8072,42 +7762,7 @@
         </w:tc>
         <w:tc>
           <w:tcPr>
-            <w:tcW w:w="6560" w:type="dxa"/>
-          </w:tcPr>
-          <w:p>
-            <w:pPr>
-              <w:pStyle w:val="Tabla"/>
-            </w:pPr>
-            <w:r>
-              <w:rPr/>
-              <w:t xml:space="preserve">Un mantenimiento preventivo se enlaza a una programación de la vigencia; si el equipo no está en la dependencia y sede programadas, el sistema pide confirmación.</w:t>
-            </w:r>
-          </w:p>
-        </w:tc>
-      </w:tr>
-      <w:tr>
-        <w:trPr>
-          <w:cantSplit/>
-        </w:trPr>
-        <w:tc>
-          <w:tcPr>
-            <w:tcW w:w="3080" w:type="dxa"/>
-            <w:shd w:val="clear" w:color="auto" w:fill="F3F5F8"/>
-          </w:tcPr>
-          <w:p>
-            <w:pPr>
-              <w:pStyle w:val="Tabla"/>
-            </w:pPr>
-            <w:r>
-              <w:rPr/>
-              <w:t xml:space="preserve">RN-29</w:t>
-            </w:r>
-          </w:p>
-        </w:tc>
-        <w:tc>
-          <w:tcPr>
-            <w:tcW w:w="6560" w:type="dxa"/>
-            <w:shd w:val="clear" w:color="auto" w:fill="F3F5F8"/>
+            <w:tcW w:w="6628" w:type="dxa"/>
           </w:tcPr>
           <w:p>
             <w:pPr>
@@ -8451,7 +8106,7 @@
             </w:pPr>
             <w:r>
               <w:rPr/>
-              <w:t xml:space="preserve">Mantenimiento</w:t>
+              <w:t xml:space="preserve">Levantamiento</w:t>
             </w:r>
           </w:p>
         </w:tc>
@@ -8465,7 +8120,7 @@
             </w:pPr>
             <w:r>
               <w:rPr/>
-              <w:t xml:space="preserve">PlanMantenimiento, ProgramaciónMantenimiento, Mantenimiento</w:t>
+              <w:t xml:space="preserve">LevantamientoActivos</w:t>
             </w:r>
           </w:p>
         </w:tc>
@@ -8479,7 +8134,7 @@
             </w:pPr>
             <w:r>
               <w:rPr/>
-              <w:t xml:space="preserve">PAMP</w:t>
+              <w:t xml:space="preserve">GT-M4 4.1</w:t>
             </w:r>
           </w:p>
         </w:tc>
@@ -8499,7 +8154,7 @@
             </w:pPr>
             <w:r>
               <w:rPr/>
-              <w:t xml:space="preserve">Levantamiento</w:t>
+              <w:t xml:space="preserve">Sistema</w:t>
             </w:r>
           </w:p>
         </w:tc>
@@ -8514,7 +8169,7 @@
             </w:pPr>
             <w:r>
               <w:rPr/>
-              <w:t xml:space="preserve">LevantamientoActivos</w:t>
+              <w:t xml:space="preserve">Usuario, Auditoría, Importación</w:t>
             </w:r>
           </w:p>
         </w:tc>
@@ -8522,53 +8177,6 @@
           <w:tcPr>
             <w:tcW w:w="3193" w:type="dxa"/>
             <w:shd w:val="clear" w:color="auto" w:fill="F3F5F8"/>
-          </w:tcPr>
-          <w:p>
-            <w:pPr>
-              <w:pStyle w:val="Tabla"/>
-            </w:pPr>
-            <w:r>
-              <w:rPr/>
-              <w:t xml:space="preserve">GT-M4 4.1</w:t>
-            </w:r>
-          </w:p>
-        </w:tc>
-      </w:tr>
-      <w:tr>
-        <w:trPr>
-          <w:cantSplit/>
-        </w:trPr>
-        <w:tc>
-          <w:tcPr>
-            <w:tcW w:w="2149" w:type="dxa"/>
-          </w:tcPr>
-          <w:p>
-            <w:pPr>
-              <w:pStyle w:val="Tabla"/>
-            </w:pPr>
-            <w:r>
-              <w:rPr/>
-              <w:t xml:space="preserve">Sistema</w:t>
-            </w:r>
-          </w:p>
-        </w:tc>
-        <w:tc>
-          <w:tcPr>
-            <w:tcW w:w="4298" w:type="dxa"/>
-          </w:tcPr>
-          <w:p>
-            <w:pPr>
-              <w:pStyle w:val="Tabla"/>
-            </w:pPr>
-            <w:r>
-              <w:rPr/>
-              <w:t xml:space="preserve">Usuario, Auditoría, Importación</w:t>
-            </w:r>
-          </w:p>
-        </w:tc>
-        <w:tc>
-          <w:tcPr>
-            <w:tcW w:w="3193" w:type="dxa"/>
           </w:tcPr>
           <w:p>
             <w:pPr>
@@ -9234,7 +8842,7 @@
       </w:r>
       <w:r>
         <w:rPr/>
-        <w:t xml:space="preserve">. El estado de funcionamiento pasa a lista cerrada: bueno, regular (requiere mantenimiento), malo (requiere componentes), no funcional (requiere baja).</w:t>
+        <w:t xml:space="preserve">. El estado de funcionamiento pasa a lista cerrada: bueno, regular (fallas menores), malo (requiere componentes), no funcional (requiere baja).</w:t>
       </w:r>
     </w:p>
     <w:tbl>
@@ -9257,10 +8865,10 @@
         </w:tblCellMar>
       </w:tblPr>
       <w:tblGrid>
-        <w:gridCol w:w="1918"/>
-        <w:gridCol w:w="2733"/>
-        <w:gridCol w:w="2110"/>
-        <w:gridCol w:w="2879"/>
+        <w:gridCol w:w="2084"/>
+        <w:gridCol w:w="2970"/>
+        <w:gridCol w:w="2240"/>
+        <w:gridCol w:w="2346"/>
       </w:tblGrid>
       <w:tr>
         <w:trPr>
@@ -9269,7 +8877,7 @@
         </w:trPr>
         <w:tc>
           <w:tcPr>
-            <w:tcW w:w="1918" w:type="dxa"/>
+            <w:tcW w:w="2084" w:type="dxa"/>
             <w:shd w:val="clear" w:color="auto" w:fill="1F3A5F"/>
           </w:tcPr>
           <w:p>
@@ -9287,7 +8895,7 @@
         </w:tc>
         <w:tc>
           <w:tcPr>
-            <w:tcW w:w="2733" w:type="dxa"/>
+            <w:tcW w:w="2970" w:type="dxa"/>
             <w:shd w:val="clear" w:color="auto" w:fill="1F3A5F"/>
           </w:tcPr>
           <w:p>
@@ -9305,7 +8913,7 @@
         </w:tc>
         <w:tc>
           <w:tcPr>
-            <w:tcW w:w="2110" w:type="dxa"/>
+            <w:tcW w:w="2240" w:type="dxa"/>
             <w:shd w:val="clear" w:color="auto" w:fill="1F3A5F"/>
           </w:tcPr>
           <w:p>
@@ -9323,7 +8931,7 @@
         </w:tc>
         <w:tc>
           <w:tcPr>
-            <w:tcW w:w="2879" w:type="dxa"/>
+            <w:tcW w:w="2346" w:type="dxa"/>
             <w:shd w:val="clear" w:color="auto" w:fill="1F3A5F"/>
           </w:tcPr>
           <w:p>
@@ -9346,7 +8954,7 @@
         </w:trPr>
         <w:tc>
           <w:tcPr>
-            <w:tcW w:w="1918" w:type="dxa"/>
+            <w:tcW w:w="2084" w:type="dxa"/>
           </w:tcPr>
           <w:p>
             <w:pPr>
@@ -9360,7 +8968,7 @@
         </w:tc>
         <w:tc>
           <w:tcPr>
-            <w:tcW w:w="2733" w:type="dxa"/>
+            <w:tcW w:w="2970" w:type="dxa"/>
           </w:tcPr>
           <w:p>
             <w:pPr>
@@ -9374,7 +8982,7 @@
         </w:tc>
         <w:tc>
           <w:tcPr>
-            <w:tcW w:w="2110" w:type="dxa"/>
+            <w:tcW w:w="2240" w:type="dxa"/>
           </w:tcPr>
           <w:p>
             <w:pPr>
@@ -9388,7 +8996,7 @@
         </w:tc>
         <w:tc>
           <w:tcPr>
-            <w:tcW w:w="2879" w:type="dxa"/>
+            <w:tcW w:w="2346" w:type="dxa"/>
           </w:tcPr>
           <w:p>
             <w:pPr>
@@ -9407,7 +9015,7 @@
         </w:trPr>
         <w:tc>
           <w:tcPr>
-            <w:tcW w:w="1918" w:type="dxa"/>
+            <w:tcW w:w="2084" w:type="dxa"/>
             <w:shd w:val="clear" w:color="auto" w:fill="F3F5F8"/>
           </w:tcPr>
           <w:p>
@@ -9422,7 +9030,7 @@
         </w:tc>
         <w:tc>
           <w:tcPr>
-            <w:tcW w:w="2733" w:type="dxa"/>
+            <w:tcW w:w="2970" w:type="dxa"/>
             <w:shd w:val="clear" w:color="auto" w:fill="F3F5F8"/>
           </w:tcPr>
           <w:p>
@@ -9437,7 +9045,7 @@
         </w:tc>
         <w:tc>
           <w:tcPr>
-            <w:tcW w:w="2110" w:type="dxa"/>
+            <w:tcW w:w="2240" w:type="dxa"/>
             <w:shd w:val="clear" w:color="auto" w:fill="F3F5F8"/>
           </w:tcPr>
           <w:p>
@@ -9452,7 +9060,7 @@
         </w:tc>
         <w:tc>
           <w:tcPr>
-            <w:tcW w:w="2879" w:type="dxa"/>
+            <w:tcW w:w="2346" w:type="dxa"/>
             <w:shd w:val="clear" w:color="auto" w:fill="F3F5F8"/>
           </w:tcPr>
           <w:p>
@@ -9472,7 +9080,7 @@
         </w:trPr>
         <w:tc>
           <w:tcPr>
-            <w:tcW w:w="1918" w:type="dxa"/>
+            <w:tcW w:w="2084" w:type="dxa"/>
           </w:tcPr>
           <w:p>
             <w:pPr>
@@ -9486,7 +9094,7 @@
         </w:tc>
         <w:tc>
           <w:tcPr>
-            <w:tcW w:w="2733" w:type="dxa"/>
+            <w:tcW w:w="2970" w:type="dxa"/>
           </w:tcPr>
           <w:p>
             <w:pPr>
@@ -9500,7 +9108,7 @@
         </w:tc>
         <w:tc>
           <w:tcPr>
-            <w:tcW w:w="2110" w:type="dxa"/>
+            <w:tcW w:w="2240" w:type="dxa"/>
           </w:tcPr>
           <w:p>
             <w:pPr>
@@ -9514,7 +9122,7 @@
         </w:tc>
         <w:tc>
           <w:tcPr>
-            <w:tcW w:w="2879" w:type="dxa"/>
+            <w:tcW w:w="2346" w:type="dxa"/>
           </w:tcPr>
           <w:p>
             <w:pPr>
@@ -9533,18 +9141,82 @@
         </w:trPr>
         <w:tc>
           <w:tcPr>
-            <w:tcW w:w="1918" w:type="dxa"/>
-            <w:shd w:val="clear" w:color="auto" w:fill="F3F5F8"/>
-          </w:tcPr>
-          <w:p>
-            <w:pPr>
-              <w:pStyle w:val="Tabla"/>
-            </w:pPr>
-            <w:r>
-              <w:rPr>
-                <w:b/>
-              </w:rPr>
-              <w:t xml:space="preserve">Mantenimiento</w:t>
+            <w:tcW w:w="2084" w:type="dxa"/>
+            <w:shd w:val="clear" w:color="auto" w:fill="F3F5F8"/>
+          </w:tcPr>
+          <w:p>
+            <w:pPr>
+              <w:pStyle w:val="Tabla"/>
+            </w:pPr>
+            <w:r>
+              <w:rPr/>
+              <w:t xml:space="preserve">Diagnóstico</w:t>
+            </w:r>
+          </w:p>
+        </w:tc>
+        <w:tc>
+          <w:tcPr>
+            <w:tcW w:w="2970" w:type="dxa"/>
+            <w:shd w:val="clear" w:color="auto" w:fill="F3F5F8"/>
+          </w:tcPr>
+          <w:p>
+            <w:pPr>
+              <w:pStyle w:val="Tabla"/>
+            </w:pPr>
+            <w:r>
+              <w:rPr/>
+              <w:t xml:space="preserve">Ninguno</w:t>
+            </w:r>
+          </w:p>
+        </w:tc>
+        <w:tc>
+          <w:tcPr>
+            <w:tcW w:w="2240" w:type="dxa"/>
+            <w:shd w:val="clear" w:color="auto" w:fill="F3F5F8"/>
+          </w:tcPr>
+          <w:p>
+            <w:pPr>
+              <w:pStyle w:val="Tabla"/>
+            </w:pPr>
+            <w:r>
+              <w:rPr/>
+              <w:t xml:space="preserve">Según el caso</w:t>
+            </w:r>
+          </w:p>
+        </w:tc>
+        <w:tc>
+          <w:tcPr>
+            <w:tcW w:w="2346" w:type="dxa"/>
+            <w:shd w:val="clear" w:color="auto" w:fill="F3F5F8"/>
+          </w:tcPr>
+          <w:p>
+            <w:pPr>
+              <w:pStyle w:val="Tabla"/>
+            </w:pPr>
+            <w:r>
+              <w:rPr/>
+              <w:t xml:space="preserve">Estado, causa, recomendaciones</w:t>
+            </w:r>
+          </w:p>
+        </w:tc>
+      </w:tr>
+      <w:tr>
+        <w:trPr>
+          <w:cantSplit/>
+        </w:trPr>
+        <w:tc>
+          <w:tcPr>
+            <w:tcW w:w="2084" w:type="dxa"/>
+          </w:tcPr>
+          <w:p>
+            <w:pPr>
+              <w:pStyle w:val="Tabla"/>
+            </w:pPr>
+            <w:r>
+              <w:rPr>
+                <w:b/>
+              </w:rPr>
+              <w:t xml:space="preserve">Valoración</w:t>
             </w:r>
             <w:r>
               <w:rPr/>
@@ -9554,71 +9226,133 @@
         </w:tc>
         <w:tc>
           <w:tcPr>
-            <w:tcW w:w="2733" w:type="dxa"/>
-            <w:shd w:val="clear" w:color="auto" w:fill="F3F5F8"/>
-          </w:tcPr>
-          <w:p>
-            <w:pPr>
-              <w:pStyle w:val="Tabla"/>
-            </w:pPr>
-            <w:r>
-              <w:rPr/>
-              <w:t xml:space="preserve">Actualiza el estado de funcionamiento</w:t>
-            </w:r>
-          </w:p>
-        </w:tc>
-        <w:tc>
-          <w:tcPr>
-            <w:tcW w:w="2110" w:type="dxa"/>
-            <w:shd w:val="clear" w:color="auto" w:fill="F3F5F8"/>
-          </w:tcPr>
-          <w:p>
-            <w:pPr>
-              <w:pStyle w:val="Tabla"/>
-            </w:pPr>
-            <w:r>
-              <w:rPr/>
-              <w:t xml:space="preserve">Formato de mantenimiento (si aplica)</w:t>
-            </w:r>
-          </w:p>
-        </w:tc>
-        <w:tc>
-          <w:tcPr>
-            <w:tcW w:w="2879" w:type="dxa"/>
-            <w:shd w:val="clear" w:color="auto" w:fill="F3F5F8"/>
-          </w:tcPr>
-          <w:p>
-            <w:pPr>
-              <w:pStyle w:val="Tabla"/>
-            </w:pPr>
-            <w:r>
-              <w:rPr/>
-              <w:t xml:space="preserve">Tipo, programación, actividades, hallazgos, duración</w:t>
-            </w:r>
-          </w:p>
-        </w:tc>
-      </w:tr>
-      <w:tr>
-        <w:trPr>
-          <w:cantSplit/>
-        </w:trPr>
-        <w:tc>
-          <w:tcPr>
-            <w:tcW w:w="1918" w:type="dxa"/>
-          </w:tcPr>
-          <w:p>
-            <w:pPr>
-              <w:pStyle w:val="Tabla"/>
-            </w:pPr>
-            <w:r>
-              <w:rPr/>
-              <w:t xml:space="preserve">Diagnóstico</w:t>
-            </w:r>
-          </w:p>
-        </w:tc>
-        <w:tc>
-          <w:tcPr>
-            <w:tcW w:w="2733" w:type="dxa"/>
+            <w:tcW w:w="2970" w:type="dxa"/>
+          </w:tcPr>
+          <w:p>
+            <w:pPr>
+              <w:pStyle w:val="Tabla"/>
+            </w:pPr>
+            <w:r>
+              <w:rPr/>
+              <w:t xml:space="preserve">Reemplaza la valoración vigente</w:t>
+            </w:r>
+          </w:p>
+        </w:tc>
+        <w:tc>
+          <w:tcPr>
+            <w:tcW w:w="2240" w:type="dxa"/>
+          </w:tcPr>
+          <w:p>
+            <w:pPr>
+              <w:pStyle w:val="Tabla"/>
+            </w:pPr>
+            <w:r>
+              <w:rPr/>
+              <w:t xml:space="preserve">No (el acta va en el levantamiento)</w:t>
+            </w:r>
+          </w:p>
+        </w:tc>
+        <w:tc>
+          <w:tcPr>
+            <w:tcW w:w="2346" w:type="dxa"/>
+          </w:tcPr>
+          <w:p>
+            <w:pPr>
+              <w:pStyle w:val="Tabla"/>
+            </w:pPr>
+            <w:r>
+              <w:rPr/>
+              <w:t xml:space="preserve">CID, atributos, propietario, custodio</w:t>
+            </w:r>
+          </w:p>
+        </w:tc>
+      </w:tr>
+      <w:tr>
+        <w:trPr>
+          <w:cantSplit/>
+        </w:trPr>
+        <w:tc>
+          <w:tcPr>
+            <w:tcW w:w="2084" w:type="dxa"/>
+            <w:shd w:val="clear" w:color="auto" w:fill="F3F5F8"/>
+          </w:tcPr>
+          <w:p>
+            <w:pPr>
+              <w:pStyle w:val="Tabla"/>
+            </w:pPr>
+            <w:r>
+              <w:rPr/>
+              <w:t xml:space="preserve">Baja</w:t>
+            </w:r>
+          </w:p>
+        </w:tc>
+        <w:tc>
+          <w:tcPr>
+            <w:tcW w:w="2970" w:type="dxa"/>
+            <w:shd w:val="clear" w:color="auto" w:fill="F3F5F8"/>
+          </w:tcPr>
+          <w:p>
+            <w:pPr>
+              <w:pStyle w:val="Tabla"/>
+            </w:pPr>
+            <w:r>
+              <w:rPr/>
+              <w:t xml:space="preserve">→ Dado de baja</w:t>
+            </w:r>
+          </w:p>
+        </w:tc>
+        <w:tc>
+          <w:tcPr>
+            <w:tcW w:w="2240" w:type="dxa"/>
+            <w:shd w:val="clear" w:color="auto" w:fill="F3F5F8"/>
+          </w:tcPr>
+          <w:p>
+            <w:pPr>
+              <w:pStyle w:val="Tabla"/>
+            </w:pPr>
+            <w:r>
+              <w:rPr/>
+              <w:t xml:space="preserve">Formato de baja</w:t>
+            </w:r>
+          </w:p>
+        </w:tc>
+        <w:tc>
+          <w:tcPr>
+            <w:tcW w:w="2346" w:type="dxa"/>
+            <w:shd w:val="clear" w:color="auto" w:fill="F3F5F8"/>
+          </w:tcPr>
+          <w:p>
+            <w:pPr>
+              <w:pStyle w:val="Tabla"/>
+            </w:pPr>
+            <w:r>
+              <w:rPr/>
+              <w:t xml:space="preserve">Motivo, diagnóstico</w:t>
+            </w:r>
+          </w:p>
+        </w:tc>
+      </w:tr>
+      <w:tr>
+        <w:trPr>
+          <w:cantSplit/>
+        </w:trPr>
+        <w:tc>
+          <w:tcPr>
+            <w:tcW w:w="2084" w:type="dxa"/>
+          </w:tcPr>
+          <w:p>
+            <w:pPr>
+              <w:pStyle w:val="Tabla"/>
+            </w:pPr>
+            <w:r>
+              <w:rPr/>
+              <w:t xml:space="preserve">Actualización de datos</w:t>
+            </w:r>
+          </w:p>
+        </w:tc>
+        <w:tc>
+          <w:tcPr>
+            <w:tcW w:w="2970" w:type="dxa"/>
           </w:tcPr>
           <w:p>
             <w:pPr>
@@ -9632,203 +9366,7 @@
         </w:tc>
         <w:tc>
           <w:tcPr>
-            <w:tcW w:w="2110" w:type="dxa"/>
-          </w:tcPr>
-          <w:p>
-            <w:pPr>
-              <w:pStyle w:val="Tabla"/>
-            </w:pPr>
-            <w:r>
-              <w:rPr/>
-              <w:t xml:space="preserve">Según el caso</w:t>
-            </w:r>
-          </w:p>
-        </w:tc>
-        <w:tc>
-          <w:tcPr>
-            <w:tcW w:w="2879" w:type="dxa"/>
-          </w:tcPr>
-          <w:p>
-            <w:pPr>
-              <w:pStyle w:val="Tabla"/>
-            </w:pPr>
-            <w:r>
-              <w:rPr/>
-              <w:t xml:space="preserve">Estado, causa, recomendaciones</w:t>
-            </w:r>
-          </w:p>
-        </w:tc>
-      </w:tr>
-      <w:tr>
-        <w:trPr>
-          <w:cantSplit/>
-        </w:trPr>
-        <w:tc>
-          <w:tcPr>
-            <w:tcW w:w="1918" w:type="dxa"/>
-            <w:shd w:val="clear" w:color="auto" w:fill="F3F5F8"/>
-          </w:tcPr>
-          <w:p>
-            <w:pPr>
-              <w:pStyle w:val="Tabla"/>
-            </w:pPr>
-            <w:r>
-              <w:rPr>
-                <w:b/>
-              </w:rPr>
-              <w:t xml:space="preserve">Valoración</w:t>
-            </w:r>
-            <w:r>
-              <w:rPr/>
-              <w:t xml:space="preserve"> (nuevo)</w:t>
-            </w:r>
-          </w:p>
-        </w:tc>
-        <w:tc>
-          <w:tcPr>
-            <w:tcW w:w="2733" w:type="dxa"/>
-            <w:shd w:val="clear" w:color="auto" w:fill="F3F5F8"/>
-          </w:tcPr>
-          <w:p>
-            <w:pPr>
-              <w:pStyle w:val="Tabla"/>
-            </w:pPr>
-            <w:r>
-              <w:rPr/>
-              <w:t xml:space="preserve">Reemplaza la valoración vigente</w:t>
-            </w:r>
-          </w:p>
-        </w:tc>
-        <w:tc>
-          <w:tcPr>
-            <w:tcW w:w="2110" w:type="dxa"/>
-            <w:shd w:val="clear" w:color="auto" w:fill="F3F5F8"/>
-          </w:tcPr>
-          <w:p>
-            <w:pPr>
-              <w:pStyle w:val="Tabla"/>
-            </w:pPr>
-            <w:r>
-              <w:rPr/>
-              <w:t xml:space="preserve">No (el acta va en el levantamiento)</w:t>
-            </w:r>
-          </w:p>
-        </w:tc>
-        <w:tc>
-          <w:tcPr>
-            <w:tcW w:w="2879" w:type="dxa"/>
-            <w:shd w:val="clear" w:color="auto" w:fill="F3F5F8"/>
-          </w:tcPr>
-          <w:p>
-            <w:pPr>
-              <w:pStyle w:val="Tabla"/>
-            </w:pPr>
-            <w:r>
-              <w:rPr/>
-              <w:t xml:space="preserve">CID, atributos, propietario, custodio</w:t>
-            </w:r>
-          </w:p>
-        </w:tc>
-      </w:tr>
-      <w:tr>
-        <w:trPr>
-          <w:cantSplit/>
-        </w:trPr>
-        <w:tc>
-          <w:tcPr>
-            <w:tcW w:w="1918" w:type="dxa"/>
-          </w:tcPr>
-          <w:p>
-            <w:pPr>
-              <w:pStyle w:val="Tabla"/>
-            </w:pPr>
-            <w:r>
-              <w:rPr/>
-              <w:t xml:space="preserve">Baja</w:t>
-            </w:r>
-          </w:p>
-        </w:tc>
-        <w:tc>
-          <w:tcPr>
-            <w:tcW w:w="2733" w:type="dxa"/>
-          </w:tcPr>
-          <w:p>
-            <w:pPr>
-              <w:pStyle w:val="Tabla"/>
-            </w:pPr>
-            <w:r>
-              <w:rPr/>
-              <w:t xml:space="preserve">→ Dado de baja</w:t>
-            </w:r>
-          </w:p>
-        </w:tc>
-        <w:tc>
-          <w:tcPr>
-            <w:tcW w:w="2110" w:type="dxa"/>
-          </w:tcPr>
-          <w:p>
-            <w:pPr>
-              <w:pStyle w:val="Tabla"/>
-            </w:pPr>
-            <w:r>
-              <w:rPr/>
-              <w:t xml:space="preserve">Formato de baja</w:t>
-            </w:r>
-          </w:p>
-        </w:tc>
-        <w:tc>
-          <w:tcPr>
-            <w:tcW w:w="2879" w:type="dxa"/>
-          </w:tcPr>
-          <w:p>
-            <w:pPr>
-              <w:pStyle w:val="Tabla"/>
-            </w:pPr>
-            <w:r>
-              <w:rPr/>
-              <w:t xml:space="preserve">Motivo, diagnóstico</w:t>
-            </w:r>
-          </w:p>
-        </w:tc>
-      </w:tr>
-      <w:tr>
-        <w:trPr>
-          <w:cantSplit/>
-        </w:trPr>
-        <w:tc>
-          <w:tcPr>
-            <w:tcW w:w="1918" w:type="dxa"/>
-            <w:shd w:val="clear" w:color="auto" w:fill="F3F5F8"/>
-          </w:tcPr>
-          <w:p>
-            <w:pPr>
-              <w:pStyle w:val="Tabla"/>
-            </w:pPr>
-            <w:r>
-              <w:rPr/>
-              <w:t xml:space="preserve">Actualización de datos</w:t>
-            </w:r>
-          </w:p>
-        </w:tc>
-        <w:tc>
-          <w:tcPr>
-            <w:tcW w:w="2733" w:type="dxa"/>
-            <w:shd w:val="clear" w:color="auto" w:fill="F3F5F8"/>
-          </w:tcPr>
-          <w:p>
-            <w:pPr>
-              <w:pStyle w:val="Tabla"/>
-            </w:pPr>
-            <w:r>
-              <w:rPr/>
-              <w:t xml:space="preserve">Ninguno</w:t>
-            </w:r>
-          </w:p>
-        </w:tc>
-        <w:tc>
-          <w:tcPr>
-            <w:tcW w:w="2110" w:type="dxa"/>
-            <w:shd w:val="clear" w:color="auto" w:fill="F3F5F8"/>
+            <w:tcW w:w="2240" w:type="dxa"/>
           </w:tcPr>
           <w:p>
             <w:pPr>
@@ -9842,8 +9380,7 @@
         </w:tc>
         <w:tc>
           <w:tcPr>
-            <w:tcW w:w="2879" w:type="dxa"/>
-            <w:shd w:val="clear" w:color="auto" w:fill="F3F5F8"/>
+            <w:tcW w:w="2346" w:type="dxa"/>
           </w:tcPr>
           <w:p>
             <w:pPr>
@@ -9862,7 +9399,8 @@
         </w:trPr>
         <w:tc>
           <w:tcPr>
-            <w:tcW w:w="1918" w:type="dxa"/>
+            <w:tcW w:w="2084" w:type="dxa"/>
+            <w:shd w:val="clear" w:color="auto" w:fill="F3F5F8"/>
           </w:tcPr>
           <w:p>
             <w:pPr>
@@ -9876,7 +9414,8 @@
         </w:tc>
         <w:tc>
           <w:tcPr>
-            <w:tcW w:w="2733" w:type="dxa"/>
+            <w:tcW w:w="2970" w:type="dxa"/>
+            <w:shd w:val="clear" w:color="auto" w:fill="F3F5F8"/>
           </w:tcPr>
           <w:p>
             <w:pPr>
@@ -9890,7 +9429,8 @@
         </w:tc>
         <w:tc>
           <w:tcPr>
-            <w:tcW w:w="2110" w:type="dxa"/>
+            <w:tcW w:w="2240" w:type="dxa"/>
+            <w:shd w:val="clear" w:color="auto" w:fill="F3F5F8"/>
           </w:tcPr>
           <w:p>
             <w:pPr>
@@ -9904,7 +9444,8 @@
         </w:tc>
         <w:tc>
           <w:tcPr>
-            <w:tcW w:w="2879" w:type="dxa"/>
+            <w:tcW w:w="2346" w:type="dxa"/>
+            <w:shd w:val="clear" w:color="auto" w:fill="F3F5F8"/>
           </w:tcPr>
           <w:p>
             <w:pPr>
@@ -10335,7 +9876,7 @@
             </w:pPr>
             <w:r>
               <w:rPr/>
-              <w:t xml:space="preserve">Registrar el plan anual de mantenimiento</w:t>
+              <w:t xml:space="preserve">Administrar la estructura organizacional</w:t>
             </w:r>
           </w:p>
         </w:tc>
@@ -10349,7 +9890,7 @@
             </w:pPr>
             <w:r>
               <w:rPr/>
-              <w:t xml:space="preserve">Usuario</w:t>
+              <w:t xml:space="preserve">Administrador</w:t>
             </w:r>
           </w:p>
         </w:tc>
@@ -10363,198 +9904,7 @@
             </w:pPr>
             <w:r>
               <w:rPr/>
-              <w:t xml:space="preserve">RF-60</w:t>
-            </w:r>
-          </w:p>
-        </w:tc>
-      </w:tr>
-      <w:tr>
-        <w:trPr>
-          <w:cantSplit/>
-        </w:trPr>
-        <w:tc>
-          <w:tcPr>
-            <w:tcW w:w="1664" w:type="dxa"/>
-            <w:shd w:val="clear" w:color="auto" w:fill="F3F5F8"/>
-          </w:tcPr>
-          <w:p>
-            <w:pPr>
-              <w:pStyle w:val="Tabla"/>
-            </w:pPr>
-            <w:r>
-              <w:rPr/>
-              <w:t xml:space="preserve">CU-20</w:t>
-            </w:r>
-          </w:p>
-        </w:tc>
-        <w:tc>
-          <w:tcPr>
-            <w:tcW w:w="4577" w:type="dxa"/>
-            <w:shd w:val="clear" w:color="auto" w:fill="F3F5F8"/>
-          </w:tcPr>
-          <w:p>
-            <w:pPr>
-              <w:pStyle w:val="Tabla"/>
-            </w:pPr>
-            <w:r>
-              <w:rPr/>
-              <w:t xml:space="preserve">Ejecutar un mantenimiento programado</w:t>
-            </w:r>
-          </w:p>
-        </w:tc>
-        <w:tc>
-          <w:tcPr>
-            <w:tcW w:w="1456" w:type="dxa"/>
-            <w:shd w:val="clear" w:color="auto" w:fill="F3F5F8"/>
-          </w:tcPr>
-          <w:p>
-            <w:pPr>
-              <w:pStyle w:val="Tabla"/>
-            </w:pPr>
-            <w:r>
-              <w:rPr/>
-              <w:t xml:space="preserve">Usuario</w:t>
-            </w:r>
-          </w:p>
-        </w:tc>
-        <w:tc>
-          <w:tcPr>
-            <w:tcW w:w="1943" w:type="dxa"/>
-            <w:shd w:val="clear" w:color="auto" w:fill="F3F5F8"/>
-          </w:tcPr>
-          <w:p>
-            <w:pPr>
-              <w:pStyle w:val="Tabla"/>
-            </w:pPr>
-            <w:r>
-              <w:rPr/>
-              <w:t xml:space="preserve">RF-61, RF-62, RF-64</w:t>
-            </w:r>
-          </w:p>
-        </w:tc>
-      </w:tr>
-      <w:tr>
-        <w:trPr>
-          <w:cantSplit/>
-        </w:trPr>
-        <w:tc>
-          <w:tcPr>
-            <w:tcW w:w="1664" w:type="dxa"/>
-          </w:tcPr>
-          <w:p>
-            <w:pPr>
-              <w:pStyle w:val="Tabla"/>
-            </w:pPr>
-            <w:r>
-              <w:rPr/>
-              <w:t xml:space="preserve">CU-21</w:t>
-            </w:r>
-          </w:p>
-        </w:tc>
-        <w:tc>
-          <w:tcPr>
-            <w:tcW w:w="4577" w:type="dxa"/>
-          </w:tcPr>
-          <w:p>
-            <w:pPr>
-              <w:pStyle w:val="Tabla"/>
-            </w:pPr>
-            <w:r>
-              <w:rPr/>
-              <w:t xml:space="preserve">Consultar el cumplimiento del plan</w:t>
-            </w:r>
-          </w:p>
-        </w:tc>
-        <w:tc>
-          <w:tcPr>
-            <w:tcW w:w="1456" w:type="dxa"/>
-          </w:tcPr>
-          <w:p>
-            <w:pPr>
-              <w:pStyle w:val="Tabla"/>
-            </w:pPr>
-            <w:r>
-              <w:rPr/>
-              <w:t xml:space="preserve">Usuario</w:t>
-            </w:r>
-          </w:p>
-        </w:tc>
-        <w:tc>
-          <w:tcPr>
-            <w:tcW w:w="1943" w:type="dxa"/>
-          </w:tcPr>
-          <w:p>
-            <w:pPr>
-              <w:pStyle w:val="Tabla"/>
-            </w:pPr>
-            <w:r>
-              <w:rPr/>
-              <w:t xml:space="preserve">RF-63</w:t>
-            </w:r>
-          </w:p>
-        </w:tc>
-      </w:tr>
-      <w:tr>
-        <w:trPr>
-          <w:cantSplit/>
-        </w:trPr>
-        <w:tc>
-          <w:tcPr>
-            <w:tcW w:w="1664" w:type="dxa"/>
-            <w:shd w:val="clear" w:color="auto" w:fill="F3F5F8"/>
-          </w:tcPr>
-          <w:p>
-            <w:pPr>
-              <w:pStyle w:val="Tabla"/>
-            </w:pPr>
-            <w:r>
-              <w:rPr/>
-              <w:t xml:space="preserve">CU-22</w:t>
-            </w:r>
-          </w:p>
-        </w:tc>
-        <w:tc>
-          <w:tcPr>
-            <w:tcW w:w="4577" w:type="dxa"/>
-            <w:shd w:val="clear" w:color="auto" w:fill="F3F5F8"/>
-          </w:tcPr>
-          <w:p>
-            <w:pPr>
-              <w:pStyle w:val="Tabla"/>
-            </w:pPr>
-            <w:r>
-              <w:rPr/>
-              <w:t xml:space="preserve">Administrar la estructura organizacional</w:t>
-            </w:r>
-          </w:p>
-        </w:tc>
-        <w:tc>
-          <w:tcPr>
-            <w:tcW w:w="1456" w:type="dxa"/>
-            <w:shd w:val="clear" w:color="auto" w:fill="F3F5F8"/>
-          </w:tcPr>
-          <w:p>
-            <w:pPr>
-              <w:pStyle w:val="Tabla"/>
-            </w:pPr>
-            <w:r>
-              <w:rPr/>
-              <w:t xml:space="preserve">Administrador</w:t>
-            </w:r>
-          </w:p>
-        </w:tc>
-        <w:tc>
-          <w:tcPr>
-            <w:tcW w:w="1943" w:type="dxa"/>
-            <w:shd w:val="clear" w:color="auto" w:fill="F3F5F8"/>
-          </w:tcPr>
-          <w:p>
-            <w:pPr>
-              <w:pStyle w:val="Tabla"/>
-            </w:pPr>
-            <w:r>
-              <w:rPr/>
-              <w:t xml:space="preserve">RF-45, RF-65</w:t>
+              <w:t xml:space="preserve">RF-45, RF-60</w:t>
             </w:r>
           </w:p>
         </w:tc>
@@ -10719,102 +10069,6 @@
     </w:p>
     <w:p>
       <w:pPr>
-        <w:pStyle w:val="Heading2"/>
-      </w:pPr>
-      <w:r>
-        <w:rPr/>
-        <w:t xml:space="preserve">10.3 CU-20 · Ejecutar un mantenimiento programado</w:t>
-      </w:r>
-    </w:p>
-    <w:p>
-      <w:pPr/>
-      <w:r>
-        <w:rPr>
-          <w:b/>
-        </w:rPr>
-        <w:t xml:space="preserve">Precondición:</w:t>
-      </w:r>
-      <w:r>
-        <w:rPr/>
-        <w:t xml:space="preserve"> existe un plan aprobado para la vigencia.</w:t>
-      </w:r>
-    </w:p>
-    <w:p>
-      <w:pPr>
-        <w:pStyle w:val="Lista"/>
-        <w:ind w:left="360" w:hanging="360"/>
-      </w:pPr>
-      <w:r>
-        <w:rPr/>
-        <w:t xml:space="preserve">1. Elegir la programación del mes (dependencia y sede).</w:t>
-      </w:r>
-    </w:p>
-    <w:p>
-      <w:pPr>
-        <w:pStyle w:val="Lista"/>
-        <w:ind w:left="360" w:hanging="360"/>
-      </w:pPr>
-      <w:r>
-        <w:rPr/>
-        <w:t xml:space="preserve">2. El sistema muestra la lista de trabajo con los equipos asignados ahí.</w:t>
-      </w:r>
-    </w:p>
-    <w:p>
-      <w:pPr>
-        <w:pStyle w:val="Lista"/>
-        <w:ind w:left="360" w:hanging="360"/>
-      </w:pPr>
-      <w:r>
-        <w:rPr/>
-        <w:t xml:space="preserve">3. Por cada equipo: marcar las actividades hechas, anotar hallazgos, insumos y duración, y elegir el estado resultante.</w:t>
-      </w:r>
-    </w:p>
-    <w:p>
-      <w:pPr>
-        <w:pStyle w:val="Lista"/>
-        <w:ind w:left="360" w:hanging="360"/>
-      </w:pPr>
-      <w:r>
-        <w:rPr/>
-        <w:t xml:space="preserve">4. Si se cambió una pieza, registrar en el mismo flujo el cambio de componente.</w:t>
-      </w:r>
-    </w:p>
-    <w:p>
-      <w:pPr>
-        <w:pStyle w:val="Lista"/>
-        <w:ind w:left="360" w:hanging="360"/>
-      </w:pPr>
-      <w:r>
-        <w:rPr/>
-        <w:t xml:space="preserve">5. Cada equipo queda con su evento </w:t>
-      </w:r>
-      <w:r>
-        <w:rPr>
-          <w:rFonts w:ascii="Consolas" w:hAnsi="Consolas"/>
-          <w:sz w:val="19"/>
-        </w:rPr>
-        <w:t xml:space="preserve">mantenimiento</w:t>
-      </w:r>
-      <w:r>
-        <w:rPr/>
-        <w:t xml:space="preserve">; opcionalmente se genera el formato para firma.</w:t>
-      </w:r>
-    </w:p>
-    <w:p>
-      <w:pPr/>
-      <w:r>
-        <w:rPr>
-          <w:b/>
-        </w:rPr>
-        <w:t xml:space="preserve">Alternativo:</w:t>
-      </w:r>
-      <w:r>
-        <w:rPr/>
-        <w:t xml:space="preserve"> mantenimiento correctivo, sin programación, desde la hoja de vida.</w:t>
-      </w:r>
-    </w:p>
-    <w:p>
-      <w:pPr>
         <w:pBdr>
           <w:bottom w:val="single" w:sz="6" w:space="1" w:color="C9CFD8"/>
         </w:pBdr>
@@ -10839,17 +10093,7 @@
       </w:r>
       <w:r>
         <w:rPr/>
-        <w:t xml:space="preserve"> entrega, baja, </w:t>
-      </w:r>
-      <w:r>
-        <w:rPr>
-          <w:b/>
-        </w:rPr>
-        <w:t xml:space="preserve">mantenimiento</w:t>
-      </w:r>
-      <w:r>
-        <w:rPr/>
-        <w:t xml:space="preserve"> (nuevo) y </w:t>
+        <w:t xml:space="preserve"> entrega, baja y </w:t>
       </w:r>
       <w:r>
         <w:rPr>
@@ -11056,74 +10300,6 @@
             </w:pPr>
             <w:r>
               <w:rPr/>
-              <w:t xml:space="preserve">Cumplimiento del plan de mantenimiento</w:t>
-            </w:r>
-          </w:p>
-        </w:tc>
-        <w:tc>
-          <w:tcPr>
-            <w:tcW w:w="5485" w:type="dxa"/>
-            <w:shd w:val="clear" w:color="auto" w:fill="F3F5F8"/>
-          </w:tcPr>
-          <w:p>
-            <w:pPr>
-              <w:pStyle w:val="Tabla"/>
-            </w:pPr>
-            <w:r>
-              <w:rPr/>
-              <w:t xml:space="preserve">¿Qué se ha mantenido frente a lo programado, por mes?</w:t>
-            </w:r>
-          </w:p>
-        </w:tc>
-      </w:tr>
-      <w:tr>
-        <w:trPr>
-          <w:cantSplit/>
-        </w:trPr>
-        <w:tc>
-          <w:tcPr>
-            <w:tcW w:w="4155" w:type="dxa"/>
-          </w:tcPr>
-          <w:p>
-            <w:pPr>
-              <w:pStyle w:val="Tabla"/>
-            </w:pPr>
-            <w:r>
-              <w:rPr/>
-              <w:t xml:space="preserve">Historial de mantenimientos</w:t>
-            </w:r>
-          </w:p>
-        </w:tc>
-        <w:tc>
-          <w:tcPr>
-            <w:tcW w:w="5485" w:type="dxa"/>
-          </w:tcPr>
-          <w:p>
-            <w:pPr>
-              <w:pStyle w:val="Tabla"/>
-            </w:pPr>
-            <w:r>
-              <w:rPr/>
-              <w:t xml:space="preserve">¿Qué mantenimientos tuvo un equipo o una dependencia?</w:t>
-            </w:r>
-          </w:p>
-        </w:tc>
-      </w:tr>
-      <w:tr>
-        <w:trPr>
-          <w:cantSplit/>
-        </w:trPr>
-        <w:tc>
-          <w:tcPr>
-            <w:tcW w:w="4155" w:type="dxa"/>
-            <w:shd w:val="clear" w:color="auto" w:fill="F3F5F8"/>
-          </w:tcPr>
-          <w:p>
-            <w:pPr>
-              <w:pStyle w:val="Tabla"/>
-            </w:pPr>
-            <w:r>
-              <w:rPr/>
               <w:t xml:space="preserve">Garantías y vida útil</w:t>
             </w:r>
           </w:p>
@@ -11344,11 +10520,11 @@
         <w:rPr>
           <w:b/>
         </w:rPr>
-        <w:t xml:space="preserve">Plan de mantenimiento</w:t>
-      </w:r>
-      <w:r>
-        <w:rPr/>
-        <w:t xml:space="preserve"> desde el Excel del PAMP.</w:t>
+        <w:t xml:space="preserve">Datos de adquisición</w:t>
+      </w:r>
+      <w:r>
+        <w:rPr/>
+        <w:t xml:space="preserve"> desde el archivo de Almacén (fecha, valor, proveedor, contrato, factura), cruzando por código de activo.</w:t>
       </w:r>
     </w:p>
     <w:p>
@@ -11556,7 +10732,7 @@
             </w:pPr>
             <w:r>
               <w:rPr/>
-              <w:t xml:space="preserve">Modelo v4, catálogos oficiales, personas desde la planta, ficha ampliada, valoración GT-M4, mantenimiento preventivo, matriz FOR.01, cargas nuevas, y los «importantes» de v3 que más pesan (RF-23, RF-47, RF-49, RF-51)</w:t>
+              <w:t xml:space="preserve">Modelo v4, catálogos oficiales, personas desde la planta, ficha ampliada, valoración GT-M4, levantamiento con acta, matriz FOR.01, cargas nuevas, y los «importantes» de v3 que más pesan</w:t>
             </w:r>
           </w:p>
         </w:tc>
@@ -11571,7 +10747,7 @@
             </w:pPr>
             <w:r>
               <w:rPr/>
-              <w:t xml:space="preserve">RF-01, 02, 04, 07, 09, 10, 12, 18, 19, 34, 37, 38, 39, 44, 45, 53 a 58, 60 a 62, 65 (esenciales), más RF-23, 47, 49, 51, 52, 59, 63, 64</w:t>
+              <w:t xml:space="preserve">RF-01, 02, 04, 07, 09, 10, 12, 18, 19, 34, 37, 38, 39, 44, 45, 53 a 58, 60 (esenciales), más RF-23, 26, 33, 36, 47, 49, 51, 52, 59</w:t>
             </w:r>
           </w:p>
         </w:tc>
@@ -11606,7 +10782,7 @@
             </w:pPr>
             <w:r>
               <w:rPr/>
-              <w:t xml:space="preserve">Puestos de trabajo, fotos, historial por fecha, tipos de evento configurables, tablero, anular baja</w:t>
+              <w:t xml:space="preserve">Puestos de trabajo, fotos, historial por fecha, tipos de evento configurables, destino de lo retirado, listado de bajas, cargas posteriores</w:t>
             </w:r>
           </w:p>
         </w:tc>
@@ -11620,7 +10796,7 @@
             </w:pPr>
             <w:r>
               <w:rPr/>
-              <w:t xml:space="preserve">RF-05, 06, 13, 16, 17, 26, 27, 31, 33, 36, 42</w:t>
+              <w:t xml:space="preserve">RF-05, 06, 13, 16, 17, 27, 31, 42</w:t>
             </w:r>
           </w:p>
         </w:tc>
@@ -11837,7 +11013,7 @@
             </w:pPr>
             <w:r>
               <w:rPr/>
-              <w:t xml:space="preserve">¿Se confirma que el mantenimiento preventivo entra al alcance?</w:t>
+              <w:t xml:space="preserve">¿Entran los equipos de las instituciones educativas?</w:t>
             </w:r>
           </w:p>
         </w:tc>
@@ -11851,7 +11027,7 @@
             </w:pPr>
             <w:r>
               <w:rPr/>
-              <w:t xml:space="preserve">Sí (PAMP oficial)</w:t>
+              <w:t xml:space="preserve">No por ahora</w:t>
             </w:r>
           </w:p>
         </w:tc>
@@ -11865,7 +11041,7 @@
             </w:pPr>
             <w:r>
               <w:rPr/>
-              <w:t xml:space="preserve">Se quitan RF-60 a RF-64 y sus tablas.</w:t>
+              <w:t xml:space="preserve">Cientos de sedes nuevas en 71 municipios; carga y verificación mucho más grandes.</w:t>
             </w:r>
           </w:p>
         </w:tc>
@@ -11900,7 +11076,7 @@
             </w:pPr>
             <w:r>
               <w:rPr/>
-              <w:t xml:space="preserve">¿Entran los equipos de las instituciones educativas?</w:t>
+              <w:t xml:space="preserve">¿Solo hardware y soporte, o todos los tipos de activo del GT-M4?</w:t>
             </w:r>
           </w:p>
         </w:tc>
@@ -11915,7 +11091,7 @@
             </w:pPr>
             <w:r>
               <w:rPr/>
-              <w:t xml:space="preserve">No por ahora</w:t>
+              <w:t xml:space="preserve">Solo hardware y soporte</w:t>
             </w:r>
           </w:p>
         </w:tc>
@@ -11930,7 +11106,7 @@
             </w:pPr>
             <w:r>
               <w:rPr/>
-              <w:t xml:space="preserve">Cientos de sedes nuevas en 71 municipios; carga y verificación mucho más grandes.</w:t>
+              <w:t xml:space="preserve">Haría falta una ficha de activo sin serial ni componentes.</w:t>
             </w:r>
           </w:p>
         </w:tc>
@@ -11963,7 +11139,7 @@
             </w:pPr>
             <w:r>
               <w:rPr/>
-              <w:t xml:space="preserve">¿Solo hardware y soporte, o todos los tipos de activo del GT-M4?</w:t>
+              <w:t xml:space="preserve">¿El propietario y el custodio se registran como cargo o como persona?</w:t>
             </w:r>
           </w:p>
         </w:tc>
@@ -11977,78 +11153,13 @@
             </w:pPr>
             <w:r>
               <w:rPr/>
-              <w:t xml:space="preserve">Solo hardware y soporte</w:t>
+              <w:t xml:space="preserve">Cargo en la valoración, persona en el acta</w:t>
             </w:r>
           </w:p>
         </w:tc>
         <w:tc>
           <w:tcPr>
             <w:tcW w:w="2624" w:type="dxa"/>
-          </w:tcPr>
-          <w:p>
-            <w:pPr>
-              <w:pStyle w:val="Tabla"/>
-            </w:pPr>
-            <w:r>
-              <w:rPr/>
-              <w:t xml:space="preserve">Haría falta una ficha de activo sin serial ni componentes.</w:t>
-            </w:r>
-          </w:p>
-        </w:tc>
-      </w:tr>
-      <w:tr>
-        <w:trPr>
-          <w:cantSplit/>
-        </w:trPr>
-        <w:tc>
-          <w:tcPr>
-            <w:tcW w:w="900" w:type="dxa"/>
-            <w:shd w:val="clear" w:color="auto" w:fill="F3F5F8"/>
-          </w:tcPr>
-          <w:p>
-            <w:pPr>
-              <w:pStyle w:val="Tabla"/>
-            </w:pPr>
-            <w:r>
-              <w:rPr/>
-              <w:t xml:space="preserve">4</w:t>
-            </w:r>
-          </w:p>
-        </w:tc>
-        <w:tc>
-          <w:tcPr>
-            <w:tcW w:w="3058" w:type="dxa"/>
-            <w:shd w:val="clear" w:color="auto" w:fill="F3F5F8"/>
-          </w:tcPr>
-          <w:p>
-            <w:pPr>
-              <w:pStyle w:val="Tabla"/>
-            </w:pPr>
-            <w:r>
-              <w:rPr/>
-              <w:t xml:space="preserve">¿El propietario y el custodio se registran como cargo o como persona?</w:t>
-            </w:r>
-          </w:p>
-        </w:tc>
-        <w:tc>
-          <w:tcPr>
-            <w:tcW w:w="3058" w:type="dxa"/>
-            <w:shd w:val="clear" w:color="auto" w:fill="F3F5F8"/>
-          </w:tcPr>
-          <w:p>
-            <w:pPr>
-              <w:pStyle w:val="Tabla"/>
-            </w:pPr>
-            <w:r>
-              <w:rPr/>
-              <w:t xml:space="preserve">Cargo en la valoración, persona en el acta</w:t>
-            </w:r>
-          </w:p>
-        </w:tc>
-        <w:tc>
-          <w:tcPr>
-            <w:tcW w:w="2624" w:type="dxa"/>
-            <w:shd w:val="clear" w:color="auto" w:fill="F3F5F8"/>
           </w:tcPr>
           <w:p>
             <w:pPr>
@@ -12079,6 +11190,71 @@
         <w:tc>
           <w:tcPr>
             <w:tcW w:w="900" w:type="dxa"/>
+            <w:shd w:val="clear" w:color="auto" w:fill="F3F5F8"/>
+          </w:tcPr>
+          <w:p>
+            <w:pPr>
+              <w:pStyle w:val="Tabla"/>
+            </w:pPr>
+            <w:r>
+              <w:rPr/>
+              <w:t xml:space="preserve">4</w:t>
+            </w:r>
+          </w:p>
+        </w:tc>
+        <w:tc>
+          <w:tcPr>
+            <w:tcW w:w="3058" w:type="dxa"/>
+            <w:shd w:val="clear" w:color="auto" w:fill="F3F5F8"/>
+          </w:tcPr>
+          <w:p>
+            <w:pPr>
+              <w:pStyle w:val="Tabla"/>
+            </w:pPr>
+            <w:r>
+              <w:rPr/>
+              <w:t xml:space="preserve">Tipo de cada proceso según el mapa del SIG.</w:t>
+            </w:r>
+          </w:p>
+        </w:tc>
+        <w:tc>
+          <w:tcPr>
+            <w:tcW w:w="3058" w:type="dxa"/>
+            <w:shd w:val="clear" w:color="auto" w:fill="F3F5F8"/>
+          </w:tcPr>
+          <w:p>
+            <w:pPr>
+              <w:pStyle w:val="Tabla"/>
+            </w:pPr>
+            <w:r>
+              <w:rPr/>
+              <w:t xml:space="preserve">Tabla 5.1 de base-de-datos.md</w:t>
+            </w:r>
+          </w:p>
+        </w:tc>
+        <w:tc>
+          <w:tcPr>
+            <w:tcW w:w="2624" w:type="dxa"/>
+            <w:shd w:val="clear" w:color="auto" w:fill="F3F5F8"/>
+          </w:tcPr>
+          <w:p>
+            <w:pPr>
+              <w:pStyle w:val="Tabla"/>
+            </w:pPr>
+            <w:r>
+              <w:rPr/>
+              <w:t xml:space="preserve">Solo cambia el seeder.</w:t>
+            </w:r>
+          </w:p>
+        </w:tc>
+      </w:tr>
+      <w:tr>
+        <w:trPr>
+          <w:cantSplit/>
+        </w:trPr>
+        <w:tc>
+          <w:tcPr>
+            <w:tcW w:w="900" w:type="dxa"/>
           </w:tcPr>
           <w:p>
             <w:pPr>
@@ -12100,7 +11276,7 @@
             </w:pPr>
             <w:r>
               <w:rPr/>
-              <w:t xml:space="preserve">Tipo de cada proceso según el mapa del SIG.</w:t>
+              <w:t xml:space="preserve">Tenencia de Morindó, Victoria Char, Places Mall; ¿Suricentro sigue en uso?</w:t>
             </w:r>
           </w:p>
         </w:tc>
@@ -12114,7 +11290,7 @@
             </w:pPr>
             <w:r>
               <w:rPr/>
-              <w:t xml:space="preserve">Tabla 5.1 de base-de-datos.md</w:t>
+              <w:t xml:space="preserve">Por confirmar</w:t>
             </w:r>
           </w:p>
         </w:tc>
@@ -12163,7 +11339,7 @@
             </w:pPr>
             <w:r>
               <w:rPr/>
-              <w:t xml:space="preserve">Tenencia de Morindó, Victoria Char, Places Mall; ¿Suricentro sigue en uso?</w:t>
+              <w:t xml:space="preserve">¿De quién dependen Pensiones, Biblioparque y el Grupo Anticontrabando?</w:t>
             </w:r>
           </w:p>
         </w:tc>
@@ -12178,7 +11354,7 @@
             </w:pPr>
             <w:r>
               <w:rPr/>
-              <w:t xml:space="preserve">Por confirmar</w:t>
+              <w:t xml:space="preserve">Ver base-de-datos.md 5.2</w:t>
             </w:r>
           </w:p>
         </w:tc>
@@ -12193,7 +11369,7 @@
             </w:pPr>
             <w:r>
               <w:rPr/>
-              <w:t xml:space="preserve">Solo cambia el seeder.</w:t>
+              <w:t xml:space="preserve">Solo cambia el árbol.</w:t>
             </w:r>
           </w:p>
         </w:tc>
@@ -12226,7 +11402,7 @@
             </w:pPr>
             <w:r>
               <w:rPr/>
-              <w:t xml:space="preserve">¿De quién dependen Pensiones, Biblioparque y el Grupo Anticontrabando?</w:t>
+              <w:t xml:space="preserve">¿Qué código del SIG llevarán los formatos (entrega, baja, acta de aceptación)?</w:t>
             </w:r>
           </w:p>
         </w:tc>
@@ -12240,7 +11416,7 @@
             </w:pPr>
             <w:r>
               <w:rPr/>
-              <w:t xml:space="preserve">Ver base-de-datos.md 5.2</w:t>
+              <w:t xml:space="preserve">Sin código</w:t>
             </w:r>
           </w:p>
         </w:tc>
@@ -12254,7 +11430,7 @@
             </w:pPr>
             <w:r>
               <w:rPr/>
-              <w:t xml:space="preserve">Solo cambia el árbol.</w:t>
+              <w:t xml:space="preserve">Encabezado de los PDF (RNF-21).</w:t>
             </w:r>
           </w:p>
         </w:tc>
@@ -12289,7 +11465,7 @@
             </w:pPr>
             <w:r>
               <w:rPr/>
-              <w:t xml:space="preserve">¿Qué código del SIG llevarán los formatos (entrega, baja, mantenimiento, acta)?</w:t>
+              <w:t xml:space="preserve">¿Quién suministra los datos de adquisición (Almacén) y en qué formato?</w:t>
             </w:r>
           </w:p>
         </w:tc>
@@ -12304,7 +11480,7 @@
             </w:pPr>
             <w:r>
               <w:rPr/>
-              <w:t xml:space="preserve">Sin código</w:t>
+              <w:t xml:space="preserve">Excel de Almacén</w:t>
             </w:r>
           </w:p>
         </w:tc>
@@ -12319,7 +11495,7 @@
             </w:pPr>
             <w:r>
               <w:rPr/>
-              <w:t xml:space="preserve">Encabezado de los PDF (RNF-21).</w:t>
+              <w:t xml:space="preserve">Plantilla de carga.</w:t>
             </w:r>
           </w:p>
         </w:tc>
@@ -12352,7 +11528,7 @@
             </w:pPr>
             <w:r>
               <w:rPr/>
-              <w:t xml:space="preserve">¿Quién suministra los datos de adquisición (Almacén) y en qué formato?</w:t>
+              <w:t xml:space="preserve">¿El traslado sigue con dos documentos o uno?</w:t>
             </w:r>
           </w:p>
         </w:tc>
@@ -12366,7 +11542,7 @@
             </w:pPr>
             <w:r>
               <w:rPr/>
-              <w:t xml:space="preserve">Excel de Almacén</w:t>
+              <w:t xml:space="preserve">Ambos</w:t>
             </w:r>
           </w:p>
         </w:tc>
@@ -12380,7 +11556,7 @@
             </w:pPr>
             <w:r>
               <w:rPr/>
-              <w:t xml:space="preserve">Plantilla de carga.</w:t>
+              <w:t xml:space="preserve">(Igual que en v3.)</w:t>
             </w:r>
           </w:p>
         </w:tc>
@@ -12415,7 +11591,7 @@
             </w:pPr>
             <w:r>
               <w:rPr/>
-              <w:t xml:space="preserve">¿El traslado sigue con dos documentos o uno?</w:t>
+              <w:t xml:space="preserve">¿Vista pública reducida al escanear el QR?</w:t>
             </w:r>
           </w:p>
         </w:tc>
@@ -12430,7 +11606,7 @@
             </w:pPr>
             <w:r>
               <w:rPr/>
-              <w:t xml:space="preserve">Ambos</w:t>
+              <w:t xml:space="preserve">Solo con sesión</w:t>
             </w:r>
           </w:p>
         </w:tc>
@@ -12478,7 +11654,7 @@
             </w:pPr>
             <w:r>
               <w:rPr/>
-              <w:t xml:space="preserve">¿Vista pública reducida al escanear el QR?</w:t>
+              <w:t xml:space="preserve">Funciones de la Dirección TICS y del Almacén General en el Decreto 608 (págs. 334 a 353).</w:t>
             </w:r>
           </w:p>
         </w:tc>
@@ -12492,7 +11668,7 @@
             </w:pPr>
             <w:r>
               <w:rPr/>
-              <w:t xml:space="preserve">Solo con sesión</w:t>
+              <w:t xml:space="preserve">No leídas: la herramienta solo extrajo las 80 primeras páginas de 639</w:t>
             </w:r>
           </w:p>
         </w:tc>
@@ -12506,71 +11682,6 @@
             </w:pPr>
             <w:r>
               <w:rPr/>
-              <w:t xml:space="preserve">(Igual que en v3.)</w:t>
-            </w:r>
-          </w:p>
-        </w:tc>
-      </w:tr>
-      <w:tr>
-        <w:trPr>
-          <w:cantSplit/>
-        </w:trPr>
-        <w:tc>
-          <w:tcPr>
-            <w:tcW w:w="900" w:type="dxa"/>
-            <w:shd w:val="clear" w:color="auto" w:fill="F3F5F8"/>
-          </w:tcPr>
-          <w:p>
-            <w:pPr>
-              <w:pStyle w:val="Tabla"/>
-            </w:pPr>
-            <w:r>
-              <w:rPr/>
-              <w:t xml:space="preserve">12</w:t>
-            </w:r>
-          </w:p>
-        </w:tc>
-        <w:tc>
-          <w:tcPr>
-            <w:tcW w:w="3058" w:type="dxa"/>
-            <w:shd w:val="clear" w:color="auto" w:fill="F3F5F8"/>
-          </w:tcPr>
-          <w:p>
-            <w:pPr>
-              <w:pStyle w:val="Tabla"/>
-            </w:pPr>
-            <w:r>
-              <w:rPr/>
-              <w:t xml:space="preserve">Funciones de la Dirección TICS y del Almacén General en el Decreto 608 (págs. 334 a 353).</w:t>
-            </w:r>
-          </w:p>
-        </w:tc>
-        <w:tc>
-          <w:tcPr>
-            <w:tcW w:w="3058" w:type="dxa"/>
-            <w:shd w:val="clear" w:color="auto" w:fill="F3F5F8"/>
-          </w:tcPr>
-          <w:p>
-            <w:pPr>
-              <w:pStyle w:val="Tabla"/>
-            </w:pPr>
-            <w:r>
-              <w:rPr/>
-              <w:t xml:space="preserve">No leídas: la herramienta solo extrajo las 80 primeras páginas de 639</w:t>
-            </w:r>
-          </w:p>
-        </w:tc>
-        <w:tc>
-          <w:tcPr>
-            <w:tcW w:w="2624" w:type="dxa"/>
-            <w:shd w:val="clear" w:color="auto" w:fill="F3F5F8"/>
-          </w:tcPr>
-          <w:p>
-            <w:pPr>
-              <w:pStyle w:val="Tabla"/>
-            </w:pPr>
-            <w:r>
-              <w:rPr/>
               <w:t xml:space="preserve">Podrían asignar responsabilidades del inventario y de la baja.</w:t>
             </w:r>
           </w:p>
@@ -12597,7 +11708,7 @@
       </w:pPr>
       <w:r>
         <w:rPr/>
-        <w:t xml:space="preserve">☐ Revisar v4 y el modelo de datos con el profesor y cerrar las preguntas 1 a 4.</w:t>
+        <w:t xml:space="preserve">☐ Revisar v4.1 y el modelo de datos con el profesor y cerrar las preguntas 1 a 3.</w:t>
       </w:r>
     </w:p>
     <w:p>
@@ -12685,7 +11796,7 @@
         <w:sz w:val="16"/>
         <w:color w:val="5B6472"/>
       </w:rPr>
-      <w:t xml:space="preserve">Gobernación de Córdoba · Dirección TIC · Análisis de requerimientos v4 · Página </w:t>
+      <w:t xml:space="preserve">Gobernación de Córdoba · Dirección TIC · Análisis de requerimientos v4.1 · Página </w:t>
     </w:r>
     <w:r>
       <w:rPr>

</xml_diff>

<commit_message>
docs: dejar en docs solo el analisis, el plan con prerequisitos y las tareas
- plan-fase2.md ahora empieza con lo que se debe cumplir antes de
  abarcar algo nuevo, en orden: cerrar la Fase 1 (fusionar PR #9 y #10),
  cambiar la base de datos y adaptar lo existente.
- Se aclara que el inventario 2026 no se carga con el importador actual:
  se carga en la Fase 2 con la plantilla nueva.
- Se elimina plan-2-semanas.md (Fase 1, queda en el historial de git) y
  se actualizan sus enlaces.

Co-Authored-By: Claude Opus 5.5 <noreply@anthropic.com>
</commit_message>
<xml_diff>
--- a/docs/analisis-requerimientos-v4.docx
+++ b/docs/analisis-requerimientos-v4.docx
@@ -10663,7 +10663,7 @@
               <w:rPr>
                 <w:b/>
               </w:rPr>
-              <w:t xml:space="preserve">1 — Cerrada</w:t>
+              <w:t xml:space="preserve">1 — Por cerrar</w:t>
             </w:r>
             <w:r>
               <w:rPr/>
@@ -10681,7 +10681,7 @@
             </w:pPr>
             <w:r>
               <w:rPr/>
-              <w:t xml:space="preserve">Inventario, hoja de vida, movimientos, formatos, QR, reportes, administración</w:t>
+              <w:t xml:space="preserve">Inventario, hoja de vida, movimientos, formatos, QR, reportes, administración. Faltan fusionar los PR #9 y #10 (paso 1 de plan-fase2.md).</w:t>
             </w:r>
           </w:p>
         </w:tc>
@@ -11773,7 +11773,7 @@
       </w:r>
       <w:r>
         <w:rPr/>
-        <w:t xml:space="preserve"> Base de datos v4 · Plan de Fase 2 · Normas de trabajo · Plan de la Fase 1</w:t>
+        <w:t xml:space="preserve"> Base de datos v4 · Plan de Fase 2 · Normas de trabajo</w:t>
       </w:r>
     </w:p>
     <w:sectPr>

</xml_diff>

<commit_message>
docs: dejar el plan de Fase 2 listo para que el equipo arranque
- plan-fase2.md: pasos 1 y 2 hechos, adaptacion de columnas viejas en
  los dias 1 y 2 y migracion de cierre al final del dia 2.
- Reparto ajustado a lo que ya entro con los PR #9 y #10: el QR es de
  Juan Jose, Anuar suma RF-27, Manuel toma el tablero (RF-36).
- Documento de cada integrante con lo que ya tiene listo y sus tareas.
- base-de-datos.md: migracion en dos tiempos y nombres conservados de
  v3 (activo, licencia, nombre_o_codigo, proyeccion), igual en DBML y SQL.

Co-Authored-By: Claude Opus 5.5 <noreply@anthropic.com>
</commit_message>
<xml_diff>
--- a/docs/analisis-requerimientos-v4.docx
+++ b/docs/analisis-requerimientos-v4.docx
@@ -10663,11 +10663,22 @@
               <w:rPr>
                 <w:b/>
               </w:rPr>
-              <w:t xml:space="preserve">1 — Por cerrar</w:t>
-            </w:r>
-            <w:r>
-              <w:rPr/>
-              <w:t xml:space="preserve"> (oct-2026)</w:t>
+              <w:t xml:space="preserve">1 — Cerrada</w:t>
+            </w:r>
+            <w:r>
+              <w:rPr/>
+              <w:t xml:space="preserve"> (oct-2026, </w:t>
+            </w:r>
+            <w:r>
+              <w:rPr>
+                <w:rFonts w:ascii="Consolas" w:hAnsi="Consolas"/>
+                <w:sz w:val="19"/>
+              </w:rPr>
+              <w:t xml:space="preserve">v1.0</w:t>
+            </w:r>
+            <w:r>
+              <w:rPr/>
+              <w:t xml:space="preserve">)</w:t>
             </w:r>
           </w:p>
         </w:tc>
@@ -10681,7 +10692,7 @@
             </w:pPr>
             <w:r>
               <w:rPr/>
-              <w:t xml:space="preserve">Inventario, hoja de vida, movimientos, formatos, QR, reportes, administración. Faltan fusionar los PR #9 y #10 (paso 1 de plan-fase2.md).</w:t>
+              <w:t xml:space="preserve">Inventario, hoja de vida, movimientos, formatos, QR, reportes, administración.</w:t>
             </w:r>
           </w:p>
         </w:tc>
@@ -10747,7 +10758,7 @@
             </w:pPr>
             <w:r>
               <w:rPr/>
-              <w:t xml:space="preserve">RF-01, 02, 04, 07, 09, 10, 12, 18, 19, 34, 37, 38, 39, 44, 45, 53 a 58, 60 (esenciales), más RF-23, 26, 33, 36, 47, 49, 51, 52, 59</w:t>
+              <w:t xml:space="preserve">RF-01, 02, 04, 07, 09, 10, 12, 18, 19, 34, 37, 38, 39, 44, 45, 53 a 58, 60 (esenciales), más RF-23, 27, 36, 47, 52, 59. RF-22, 26, 33, 49 y 51 ya entraron con los PR #9 y #10</w:t>
             </w:r>
           </w:p>
         </w:tc>
@@ -10782,7 +10793,7 @@
             </w:pPr>
             <w:r>
               <w:rPr/>
-              <w:t xml:space="preserve">Puestos de trabajo, fotos, historial por fecha, tipos de evento configurables, destino de lo retirado, listado de bajas, cargas posteriores</w:t>
+              <w:t xml:space="preserve">Puestos de trabajo, fotos, historial por fecha, tipos de evento configurables, destino de lo retirado, pendientes de firma, cargas posteriores</w:t>
             </w:r>
           </w:p>
         </w:tc>
@@ -10796,7 +10807,7 @@
             </w:pPr>
             <w:r>
               <w:rPr/>
-              <w:t xml:space="preserve">RF-05, 06, 13, 16, 17, 27, 31, 42</w:t>
+              <w:t xml:space="preserve">RF-05, 06, 13, 16, 17, 31, 42</w:t>
             </w:r>
           </w:p>
         </w:tc>

</xml_diff>

<commit_message>
feat: filtrar pisos y dependencias por la sede elegida en el selector de ubicacion
Al elegir la sede, x-ui.ubicacion-select solo ofrece sus pisos y las
dependencias que funcionan en ella segun el PAMP 2026; al elegir el piso,
solo las de ese piso. El enlace «Ver todas las dependencias» abre la lista
completa para oficinas que se mudaron o las 11 dependencias que el PAMP no
ubica. Si el valor guardado no esta en la sede, la lista completa se abre
sola. Cambiar la sede o el piso vacia lo que deja de ser valido.

RF-19 actualizado en el analisis; las 11 dependencias sin ubicacion quedan
como pregunta abierta para la Direccion TIC y como tarea de Manuel.

Co-Authored-By: Claude Opus 5.5 <noreply@anthropic.com>
</commit_message>
<xml_diff>
--- a/docs/analisis-requerimientos-v4.docx
+++ b/docs/analisis-requerimientos-v4.docx
@@ -4327,7 +4327,7 @@
             </w:pPr>
             <w:r>
               <w:rPr/>
-              <w:t xml:space="preserve">Registrar la ubicación como sede → piso de esa sede → dependencia del árbol oficial, proponiendo las dependencias que el PAMP ubica en ese piso. </w:t>
+              <w:t xml:space="preserve">Registrar la ubicación como sede → piso de esa sede → dependencia: al elegir la sede solo se ofrecen sus pisos y las dependencias que funcionan en ella (y en el piso, si ya se eligió), según el PAMP; un enlace «Ver todas las dependencias» abre la lista completa para los casos que el PAMP no cubre. </w:t>
             </w:r>
             <w:r>
               <w:rPr>
@@ -11694,6 +11694,82 @@
             <w:r>
               <w:rPr/>
               <w:t xml:space="preserve">Podrían asignar responsabilidades del inventario y de la baja.</w:t>
+            </w:r>
+          </w:p>
+        </w:tc>
+      </w:tr>
+      <w:tr>
+        <w:trPr>
+          <w:cantSplit/>
+        </w:trPr>
+        <w:tc>
+          <w:tcPr>
+            <w:tcW w:w="900" w:type="dxa"/>
+            <w:shd w:val="clear" w:color="auto" w:fill="F3F5F8"/>
+          </w:tcPr>
+          <w:p>
+            <w:pPr>
+              <w:pStyle w:val="Tabla"/>
+            </w:pPr>
+            <w:r>
+              <w:rPr/>
+              <w:t xml:space="preserve">12</w:t>
+            </w:r>
+          </w:p>
+        </w:tc>
+        <w:tc>
+          <w:tcPr>
+            <w:tcW w:w="3058" w:type="dxa"/>
+            <w:shd w:val="clear" w:color="auto" w:fill="F3F5F8"/>
+          </w:tcPr>
+          <w:p>
+            <w:pPr>
+              <w:pStyle w:val="Tabla"/>
+            </w:pPr>
+            <w:r>
+              <w:rPr/>
+              <w:t xml:space="preserve">¿En qué sede y piso funcionan las 11 dependencias que el PAMP no ubica (Secretaría General, Dirección Departamental de Regalías, Dirección Departamental de Proyectos, Dirección de Ciencia, Tecnología e Innovación, Dirección Administrativa y Financiera de Infraestructura, Dirección Técnica y Administrativa de Infraestructura, Dirección Administrativa de Inspección, Vigilancia y Control (Salud), Planeación en Salud, Bienestar y Capacitación, y Financiera y Administrativa de Educación)?</w:t>
+            </w:r>
+          </w:p>
+        </w:tc>
+        <w:tc>
+          <w:tcPr>
+            <w:tcW w:w="3058" w:type="dxa"/>
+            <w:shd w:val="clear" w:color="auto" w:fill="F3F5F8"/>
+          </w:tcPr>
+          <w:p>
+            <w:pPr>
+              <w:pStyle w:val="Tabla"/>
+            </w:pPr>
+            <w:r>
+              <w:rPr/>
+              <w:t xml:space="preserve">Sin ubicación: solo se eligen con «Ver todas las dependencias»</w:t>
+            </w:r>
+          </w:p>
+        </w:tc>
+        <w:tc>
+          <w:tcPr>
+            <w:tcW w:w="2624" w:type="dxa"/>
+            <w:shd w:val="clear" w:color="auto" w:fill="F3F5F8"/>
+          </w:tcPr>
+          <w:p>
+            <w:pPr>
+              <w:pStyle w:val="Tabla"/>
+            </w:pPr>
+            <w:r>
+              <w:rPr/>
+              <w:t xml:space="preserve">Se completan en </w:t>
+            </w:r>
+            <w:r>
+              <w:rPr>
+                <w:rFonts w:ascii="Consolas" w:hAnsi="Consolas"/>
+                <w:sz w:val="19"/>
+              </w:rPr>
+              <w:t xml:space="preserve">ubicaciones_dependencia</w:t>
+            </w:r>
+            <w:r>
+              <w:rPr/>
+              <w:t xml:space="preserve"> y aparecen al filtrar por sede.</w:t>
             </w:r>
           </w:p>
         </w:tc>

</xml_diff>